<commit_message>
Agregar evidencias Fase 2 (grupales, individuales y proyecto)
</commit_message>
<xml_diff>
--- a/Fase 2/Evidencias Grupales/2.4_GuiaEstudiante_Fase2_DesarrolloProyecto_APT.docx
+++ b/Fase 2/Evidencias Grupales/2.4_GuiaEstudiante_Fase2_DesarrolloProyecto_APT.docx
@@ -4,279 +4,312 @@
   <w:body>
     <w:p>
       <w:pPr>
-        <w:spacing w:after="40" w:before="0" w:lineRule="auto"/>
+        <w:rPr/>
+      </w:pPr>
+      <w:r>
+        <w:rPr>
+          <w:rtl w:val="0"/>
+        </w:rPr>
+      </w:r>
+    </w:p>
+    <w:p>
+      <w:pPr>
+        <w:rPr/>
+      </w:pPr>
+      <w:r>
+        <w:rPr>
+          <w:rtl w:val="0"/>
+        </w:rPr>
+      </w:r>
+    </w:p>
+    <w:p>
+      <w:pPr>
+        <w:rPr/>
+      </w:pPr>
+      <w:r>
+        <w:rPr>
+          <w:rtl w:val="0"/>
+        </w:rPr>
+      </w:r>
+    </w:p>
+    <w:p>
+      <w:pPr>
+        <w:rPr/>
+      </w:pPr>
+      <w:r>
+        <w:rPr>
+          <w:rtl w:val="0"/>
+        </w:rPr>
+      </w:r>
+    </w:p>
+    <w:p>
+      <w:pPr>
+        <w:rPr/>
+      </w:pPr>
+      <w:r>
+        <w:rPr>
+          <w:rtl w:val="0"/>
+        </w:rPr>
+      </w:r>
+    </w:p>
+    <w:p>
+      <w:pPr>
         <w:jc w:val="center"/>
         <w:rPr/>
       </w:pPr>
       <w:r>
         <w:rPr>
-          <w:rtl w:val="0"/>
-        </w:rPr>
-        <w:t xml:space="preserve">Duoc UC · Escuela de Informática y Telecomunicaciones</w:t>
+          <w:b w:val="1"/>
+          <w:bCs w:val="1"/>
+          <w:color w:val="2e5a88"/>
+          <w:sz w:val="60"/>
+          <w:szCs w:val="60"/>
+          <w:rtl w:val="0"/>
+        </w:rPr>
+        <w:t xml:space="preserve">AgeCare</w:t>
+      </w:r>
+      <w:r>
+        <w:rPr>
+          <w:rtl w:val="0"/>
+        </w:rPr>
       </w:r>
     </w:p>
     <w:p>
       <w:pPr>
-        <w:pBdr>
-          <w:top w:color="auto" w:space="0" w:sz="0" w:val="none"/>
-          <w:left w:color="auto" w:space="0" w:sz="0" w:val="none"/>
-          <w:bottom w:color="auto" w:space="0" w:sz="0" w:val="none"/>
-          <w:right w:color="auto" w:space="0" w:sz="0" w:val="none"/>
-          <w:between w:color="auto" w:space="0" w:sz="0" w:val="none"/>
-        </w:pBdr>
-        <w:spacing w:after="120" w:before="0" w:lineRule="auto"/>
         <w:jc w:val="center"/>
         <w:rPr/>
       </w:pPr>
       <w:r>
         <w:rPr>
-          <w:rtl w:val="0"/>
-        </w:rPr>
-        <w:t xml:space="preserve">Ingeniería en Informática · Sede San Andrés de Concepción</w:t>
+          <w:i w:val="1"/>
+          <w:iCs w:val="1"/>
+          <w:color w:val="595959"/>
+          <w:sz w:val="24"/>
+          <w:szCs w:val="24"/>
+          <w:rtl w:val="0"/>
+        </w:rPr>
+        <w:t xml:space="preserve">Plataforma digital integral de cuidado de adultos mayores</w:t>
+      </w:r>
+      <w:r>
+        <w:rPr>
+          <w:rtl w:val="0"/>
+        </w:rPr>
       </w:r>
     </w:p>
     <w:p>
       <w:pPr>
-        <w:spacing w:after="1000" w:before="0" w:lineRule="auto"/>
+        <w:rPr/>
+      </w:pPr>
+      <w:r>
+        <w:rPr>
+          <w:rtl w:val="0"/>
+        </w:rPr>
+      </w:r>
+    </w:p>
+    <w:p>
+      <w:pPr>
         <w:jc w:val="center"/>
         <w:rPr/>
       </w:pPr>
       <w:r>
         <w:rPr>
-          <w:rtl w:val="0"/>
-        </w:rPr>
-        <w:t xml:space="preserve"> </w:t>
+          <w:b w:val="1"/>
+          <w:bCs w:val="1"/>
+          <w:sz w:val="36"/>
+          <w:szCs w:val="36"/>
+          <w:rtl w:val="0"/>
+        </w:rPr>
+        <w:t xml:space="preserve">Guía 2. Desarrollo Proyecto APT — Informe de Avance (Fase 2)</w:t>
+      </w:r>
+      <w:r>
+        <w:rPr>
+          <w:rtl w:val="0"/>
+        </w:rPr>
       </w:r>
     </w:p>
     <w:p>
       <w:pPr>
-        <w:pStyle w:val="Title"/>
-        <w:spacing w:after="100" w:before="0" w:lineRule="auto"/>
         <w:jc w:val="center"/>
         <w:rPr/>
       </w:pPr>
-      <w:bookmarkStart w:colFirst="0" w:colLast="0" w:name="_heading=h.31vav0ccntxx" w:id="0"/>
-      <w:bookmarkEnd w:id="0"/>
-      <w:r>
-        <w:rPr>
-          <w:rtl w:val="0"/>
-        </w:rPr>
-        <w:t xml:space="preserve">AgeCare</w:t>
+      <w:r>
+        <w:rPr>
+          <w:color w:val="595959"/>
+          <w:sz w:val="24"/>
+          <w:szCs w:val="24"/>
+          <w:rtl w:val="0"/>
+        </w:rPr>
+        <w:t xml:space="preserve">Avance Fase 2 · Diseño del Sistema</w:t>
+      </w:r>
+      <w:r>
+        <w:rPr>
+          <w:rtl w:val="0"/>
+        </w:rPr>
       </w:r>
     </w:p>
     <w:p>
       <w:pPr>
-        <w:spacing w:after="760" w:before="0" w:lineRule="auto"/>
+        <w:rPr/>
+      </w:pPr>
+      <w:r>
+        <w:rPr>
+          <w:rtl w:val="0"/>
+        </w:rPr>
+      </w:r>
+    </w:p>
+    <w:p>
+      <w:pPr>
+        <w:rPr/>
+      </w:pPr>
+      <w:r>
+        <w:rPr>
+          <w:rtl w:val="0"/>
+        </w:rPr>
+      </w:r>
+    </w:p>
+    <w:p>
+      <w:pPr>
+        <w:rPr/>
+      </w:pPr>
+      <w:r>
+        <w:rPr>
+          <w:rtl w:val="0"/>
+        </w:rPr>
+      </w:r>
+    </w:p>
+    <w:p>
+      <w:pPr>
+        <w:rPr/>
+      </w:pPr>
+      <w:r>
+        <w:rPr>
+          <w:rtl w:val="0"/>
+        </w:rPr>
+      </w:r>
+    </w:p>
+    <w:p>
+      <w:pPr>
         <w:jc w:val="center"/>
         <w:rPr/>
       </w:pPr>
       <w:r>
         <w:rPr>
-          <w:rtl w:val="0"/>
-        </w:rPr>
-        <w:t xml:space="preserve">Plataforma digital integral de cuidado de adultos mayores</w:t>
+          <w:sz w:val="22"/>
+          <w:szCs w:val="22"/>
+          <w:rtl w:val="0"/>
+        </w:rPr>
+        <w:t xml:space="preserve">Proyecto APT · Capstone PTY4614</w:t>
+      </w:r>
+      <w:r>
+        <w:rPr>
+          <w:rtl w:val="0"/>
+        </w:rPr>
       </w:r>
     </w:p>
     <w:p>
       <w:pPr>
-        <w:spacing w:after="60" w:before="0" w:lineRule="auto"/>
         <w:jc w:val="center"/>
         <w:rPr/>
       </w:pPr>
       <w:r>
         <w:rPr>
-          <w:rtl w:val="0"/>
-        </w:rPr>
-        <w:t xml:space="preserve">Informe de Avance — Fase 2</w:t>
+          <w:sz w:val="22"/>
+          <w:szCs w:val="22"/>
+          <w:rtl w:val="0"/>
+        </w:rPr>
+        <w:t xml:space="preserve">Duoc UC · Escuela de Informática y Telecomunicaciones · Sede San Andrés de Concepción</w:t>
+      </w:r>
+      <w:r>
+        <w:rPr>
+          <w:rtl w:val="0"/>
+        </w:rPr>
       </w:r>
     </w:p>
     <w:p>
       <w:pPr>
-        <w:spacing w:after="840" w:before="0" w:lineRule="auto"/>
         <w:jc w:val="center"/>
         <w:rPr/>
       </w:pPr>
       <w:r>
         <w:rPr>
-          <w:rtl w:val="0"/>
-        </w:rPr>
-        <w:t xml:space="preserve">Guía 2. Desarrollo del Proyecto APT</w:t>
+          <w:sz w:val="22"/>
+          <w:szCs w:val="22"/>
+          <w:rtl w:val="0"/>
+        </w:rPr>
+        <w:t xml:space="preserve">Empresa contraparte: Alloxentric</w:t>
+      </w:r>
+      <w:r>
+        <w:rPr>
+          <w:rtl w:val="0"/>
+        </w:rPr>
       </w:r>
     </w:p>
     <w:p>
       <w:pPr>
-        <w:spacing w:after="60" w:before="0" w:lineRule="auto"/>
         <w:jc w:val="center"/>
         <w:rPr/>
       </w:pPr>
       <w:r>
         <w:rPr>
-          <w:rtl w:val="0"/>
-        </w:rPr>
-        <w:t xml:space="preserve">Asignatura: Capstone · PTY4614</w:t>
+          <w:sz w:val="22"/>
+          <w:szCs w:val="22"/>
+          <w:rtl w:val="0"/>
+        </w:rPr>
+        <w:t xml:space="preserve">Equipo: Javier Cerna · Benjamín Camus · Juan Mora</w:t>
+      </w:r>
+      <w:r>
+        <w:rPr>
+          <w:rtl w:val="0"/>
+        </w:rPr>
       </w:r>
     </w:p>
     <w:p>
       <w:pPr>
-        <w:spacing w:after="60" w:before="0" w:lineRule="auto"/>
         <w:jc w:val="center"/>
         <w:rPr/>
       </w:pPr>
       <w:r>
         <w:rPr>
-          <w:rtl w:val="0"/>
-        </w:rPr>
-        <w:t xml:space="preserve">Metodología: Enfoque tradicional (cascada)</w:t>
+          <w:sz w:val="22"/>
+          <w:szCs w:val="22"/>
+          <w:rtl w:val="0"/>
+        </w:rPr>
+        <w:t xml:space="preserve">Docentes: Jazna Meza Hidalgo · Juan Pablo Mellado Alarcón</w:t>
+      </w:r>
+      <w:r>
+        <w:rPr>
+          <w:rtl w:val="0"/>
+        </w:rPr>
       </w:r>
     </w:p>
     <w:p>
       <w:pPr>
-        <w:spacing w:after="720" w:before="0" w:lineRule="auto"/>
-        <w:jc w:val="center"/>
         <w:rPr/>
       </w:pPr>
       <w:r>
-        <w:rPr>
-          <w:rtl w:val="0"/>
-        </w:rPr>
-        <w:t xml:space="preserve">Empresa contraparte: Alloxentric</w:t>
+        <w:br w:type="page"/>
+      </w:r>
+      <w:r>
+        <w:rPr>
+          <w:rtl w:val="0"/>
+        </w:rPr>
       </w:r>
     </w:p>
     <w:p>
       <w:pPr>
-        <w:spacing w:after="100" w:before="0" w:lineRule="auto"/>
-        <w:jc w:val="center"/>
         <w:rPr/>
       </w:pPr>
       <w:r>
         <w:rPr>
-          <w:rtl w:val="0"/>
-        </w:rPr>
-        <w:t xml:space="preserve">EQUIPO</w:t>
-      </w:r>
-    </w:p>
-    <w:p>
-      <w:pPr>
-        <w:spacing w:after="40" w:before="0" w:lineRule="auto"/>
-        <w:jc w:val="center"/>
-        <w:rPr/>
-      </w:pPr>
-      <w:r>
-        <w:rPr>
-          <w:rtl w:val="0"/>
-        </w:rPr>
-        <w:t xml:space="preserve">Javier Cerna Chávez</w:t>
-      </w:r>
-    </w:p>
-    <w:p>
-      <w:pPr>
-        <w:spacing w:after="40" w:before="0" w:lineRule="auto"/>
-        <w:jc w:val="center"/>
-        <w:rPr/>
-      </w:pPr>
-      <w:r>
-        <w:rPr>
-          <w:rtl w:val="0"/>
-        </w:rPr>
-        <w:t xml:space="preserve">Benjamín Andrés Camus Jara</w:t>
-      </w:r>
-    </w:p>
-    <w:p>
-      <w:pPr>
-        <w:spacing w:after="540" w:before="0" w:lineRule="auto"/>
-        <w:jc w:val="center"/>
-        <w:rPr/>
-      </w:pPr>
-      <w:r>
-        <w:rPr>
-          <w:rtl w:val="0"/>
-        </w:rPr>
-        <w:t xml:space="preserve">Juan Pablo Mora Rosales</w:t>
-      </w:r>
-    </w:p>
-    <w:p>
-      <w:pPr>
-        <w:spacing w:after="100" w:before="0" w:lineRule="auto"/>
-        <w:jc w:val="center"/>
-        <w:rPr/>
-      </w:pPr>
-      <w:r>
-        <w:rPr>
-          <w:rtl w:val="0"/>
-        </w:rPr>
-        <w:t xml:space="preserve">DOCENTES</w:t>
-      </w:r>
-    </w:p>
-    <w:p>
-      <w:pPr>
-        <w:spacing w:after="40" w:before="0" w:lineRule="auto"/>
-        <w:jc w:val="center"/>
-        <w:rPr/>
-      </w:pPr>
-      <w:r>
-        <w:rPr>
-          <w:rtl w:val="0"/>
-        </w:rPr>
-        <w:t xml:space="preserve">Jazna Patricia Meza Hidalgo</w:t>
-      </w:r>
-    </w:p>
-    <w:p>
-      <w:pPr>
-        <w:spacing w:after="720" w:before="0" w:lineRule="auto"/>
-        <w:jc w:val="center"/>
-        <w:rPr/>
-      </w:pPr>
-      <w:r>
-        <w:rPr>
-          <w:rtl w:val="0"/>
-        </w:rPr>
-        <w:t xml:space="preserve">Juan Pablo Mellado Alarcón</w:t>
-      </w:r>
-    </w:p>
-    <w:p>
-      <w:pPr>
-        <w:spacing w:before="0" w:lineRule="auto"/>
-        <w:jc w:val="center"/>
-        <w:rPr/>
-      </w:pPr>
-      <w:r>
-        <w:rPr>
-          <w:rtl w:val="0"/>
-        </w:rPr>
-        <w:t xml:space="preserve">Concepción, 4 de octubre de 2026</w:t>
-      </w:r>
-    </w:p>
-    <w:p>
-      <w:pPr>
-        <w:rPr/>
-      </w:pPr>
-      <w:r>
-        <w:rPr>
-          <w:rtl w:val="0"/>
-        </w:rPr>
-      </w:r>
-    </w:p>
-    <w:p>
-      <w:pPr>
-        <w:pStyle w:val="Heading1"/>
-        <w:rPr>
-          <w:color w:val="000000"/>
-        </w:rPr>
-      </w:pPr>
-      <w:bookmarkStart w:colFirst="0" w:colLast="0" w:name="_heading=h.psxlui1h7jqj" w:id="1"/>
-      <w:bookmarkEnd w:id="1"/>
-      <w:r>
-        <w:rPr>
-          <w:color w:val="000000"/>
-          <w:rtl w:val="0"/>
-        </w:rPr>
-        <w:t xml:space="preserve">INDICE</w:t>
-      </w:r>
-    </w:p>
-    <w:p>
-      <w:pPr>
-        <w:rPr/>
-      </w:pPr>
+          <w:b w:val="1"/>
+          <w:bCs w:val="1"/>
+          <w:color w:val="2e5a88"/>
+          <w:sz w:val="32"/>
+          <w:szCs w:val="32"/>
+          <w:rtl w:val="0"/>
+        </w:rPr>
+        <w:t xml:space="preserve">Índice</w:t>
+      </w:r>
       <w:r>
         <w:rPr>
           <w:rtl w:val="0"/>
@@ -285,7 +318,7 @@
     </w:p>
     <w:sdt>
       <w:sdtPr>
-        <w:id w:val="-1946671737"/>
+        <w:id w:val="-791601405"/>
         <w:docPartObj>
           <w:docPartGallery w:val="Table of Contents"/>
           <w:docPartUnique w:val="1"/>
@@ -294,27 +327,21 @@
       <w:sdtContent>
         <w:p>
           <w:pPr>
-            <w:widowControl w:val="0"/>
             <w:tabs>
-              <w:tab w:val="right" w:leader="dot" w:pos="12000"/>
+              <w:tab w:val="right" w:leader="none" w:pos="12000"/>
             </w:tabs>
             <w:spacing w:after="0" w:before="60" w:line="240" w:lineRule="auto"/>
-            <w:rPr>
-              <w:b w:val="1"/>
-              <w:bCs w:val="1"/>
-              <w:color w:val="000000"/>
-              <w:u w:val="none"/>
-            </w:rPr>
+            <w:rPr/>
           </w:pPr>
           <w:r>
             <w:fldChar w:fldCharType="begin"/>
-            <w:instrText xml:space="preserve"> TOC \h \u \z \t "Heading 1,1,Heading 2,2,Heading 3,3,Heading 4,4,Heading 5,5,Heading 6,6,"</w:instrText>
+            <w:instrText xml:space="preserve"> TOC \h \u \z \t "Heading 1,1,Heading 2,2,Heading 3,3,"</w:instrText>
             <w:fldChar w:fldCharType="separate"/>
           </w:r>
-          <w:hyperlink w:anchor="_heading=h.psxlui1h7jqj">
-            <w:r>
-              <w:rPr>
-                <w:rFonts w:ascii="Calibri" w:cs="Calibri" w:eastAsia="Calibri" w:hAnsi="Calibri"/>
+          <w:hyperlink w:anchor="_heading=h.asprtxhm">
+            <w:r>
+              <w:rPr>
+                <w:rFonts w:ascii="Arial" w:cs="Arial" w:eastAsia="Arial" w:hAnsi="Arial"/>
                 <w:b w:val="1"/>
                 <w:bCs w:val="1"/>
                 <w:i w:val="0"/>
@@ -325,15 +352,424 @@
                 <w:sz w:val="22"/>
                 <w:szCs w:val="22"/>
                 <w:u w:val="none"/>
-                <w:shd w:fill="auto" w:val="clear"/>
                 <w:vertAlign w:val="baseline"/>
                 <w:rtl w:val="0"/>
               </w:rPr>
-              <w:t xml:space="preserve">INDICE</w:t>
+              <w:t xml:space="preserve">Guía 2. Desarrollo Proyecto APT — Informe de Avance (Fase 2)</w:t>
               <w:tab/>
-              <w:t xml:space="preserve">1</w:t>
+              <w:t xml:space="preserve">3</w:t>
             </w:r>
           </w:hyperlink>
+          <w:r>
+            <w:fldChar w:fldCharType="begin"/>
+            <w:instrText xml:space="preserve"> HYPERLINK \l "_heading=" </w:instrText>
+            <w:fldChar w:fldCharType="separate"/>
+          </w:r>
+          <w:r>
+            <w:rPr>
+              <w:rtl w:val="0"/>
+            </w:rPr>
+          </w:r>
+        </w:p>
+        <w:p>
+          <w:pPr>
+            <w:tabs>
+              <w:tab w:val="right" w:leader="none" w:pos="12000"/>
+            </w:tabs>
+            <w:spacing w:after="0" w:before="60" w:line="240" w:lineRule="auto"/>
+            <w:ind w:left="360" w:firstLine="0"/>
+            <w:rPr/>
+          </w:pPr>
+          <w:r>
+            <w:fldChar w:fldCharType="end"/>
+          </w:r>
+          <w:hyperlink w:anchor="_heading=h.niifqgje">
+            <w:r>
+              <w:rPr>
+                <w:rFonts w:ascii="Arial" w:cs="Arial" w:eastAsia="Arial" w:hAnsi="Arial"/>
+                <w:b w:val="0"/>
+                <w:bCs w:val="0"/>
+                <w:i w:val="0"/>
+                <w:iCs w:val="0"/>
+                <w:smallCaps w:val="0"/>
+                <w:strike w:val="0"/>
+                <w:color w:val="000000"/>
+                <w:sz w:val="22"/>
+                <w:szCs w:val="22"/>
+                <w:u w:val="none"/>
+                <w:vertAlign w:val="baseline"/>
+                <w:rtl w:val="0"/>
+              </w:rPr>
+              <w:t xml:space="preserve">1. Resumen de avance del Proyecto APT</w:t>
+              <w:tab/>
+              <w:t xml:space="preserve">3</w:t>
+            </w:r>
+          </w:hyperlink>
+          <w:r>
+            <w:fldChar w:fldCharType="begin"/>
+            <w:instrText xml:space="preserve"> HYPERLINK \l "_heading=" </w:instrText>
+            <w:fldChar w:fldCharType="separate"/>
+          </w:r>
+          <w:r>
+            <w:rPr>
+              <w:rtl w:val="0"/>
+            </w:rPr>
+          </w:r>
+        </w:p>
+        <w:p>
+          <w:pPr>
+            <w:tabs>
+              <w:tab w:val="right" w:leader="none" w:pos="12000"/>
+            </w:tabs>
+            <w:spacing w:after="0" w:before="60" w:line="240" w:lineRule="auto"/>
+            <w:ind w:left="720" w:firstLine="0"/>
+            <w:rPr/>
+          </w:pPr>
+          <w:r>
+            <w:fldChar w:fldCharType="end"/>
+          </w:r>
+          <w:hyperlink w:anchor="_heading=h.ryxgatsd">
+            <w:r>
+              <w:rPr>
+                <w:rFonts w:ascii="Arial" w:cs="Arial" w:eastAsia="Arial" w:hAnsi="Arial"/>
+                <w:b w:val="0"/>
+                <w:bCs w:val="0"/>
+                <w:i w:val="0"/>
+                <w:iCs w:val="0"/>
+                <w:smallCaps w:val="0"/>
+                <w:strike w:val="0"/>
+                <w:color w:val="000000"/>
+                <w:sz w:val="22"/>
+                <w:szCs w:val="22"/>
+                <w:u w:val="none"/>
+                <w:vertAlign w:val="baseline"/>
+                <w:rtl w:val="0"/>
+              </w:rPr>
+              <w:t xml:space="preserve">Objetivos (ajuste)</w:t>
+              <w:tab/>
+              <w:t xml:space="preserve">5</w:t>
+            </w:r>
+          </w:hyperlink>
+          <w:r>
+            <w:fldChar w:fldCharType="begin"/>
+            <w:instrText xml:space="preserve"> HYPERLINK \l "_heading=" </w:instrText>
+            <w:fldChar w:fldCharType="separate"/>
+          </w:r>
+          <w:r>
+            <w:rPr>
+              <w:rtl w:val="0"/>
+            </w:rPr>
+          </w:r>
+        </w:p>
+        <w:p>
+          <w:pPr>
+            <w:tabs>
+              <w:tab w:val="right" w:leader="none" w:pos="12000"/>
+            </w:tabs>
+            <w:spacing w:after="0" w:before="60" w:line="240" w:lineRule="auto"/>
+            <w:ind w:left="720" w:firstLine="0"/>
+            <w:rPr/>
+          </w:pPr>
+          <w:r>
+            <w:fldChar w:fldCharType="end"/>
+          </w:r>
+          <w:hyperlink w:anchor="_heading=h.jyakqyoz">
+            <w:r>
+              <w:rPr>
+                <w:rFonts w:ascii="Arial" w:cs="Arial" w:eastAsia="Arial" w:hAnsi="Arial"/>
+                <w:b w:val="0"/>
+                <w:bCs w:val="0"/>
+                <w:i w:val="0"/>
+                <w:iCs w:val="0"/>
+                <w:smallCaps w:val="0"/>
+                <w:strike w:val="0"/>
+                <w:color w:val="000000"/>
+                <w:sz w:val="22"/>
+                <w:szCs w:val="22"/>
+                <w:u w:val="none"/>
+                <w:vertAlign w:val="baseline"/>
+                <w:rtl w:val="0"/>
+              </w:rPr>
+              <w:t xml:space="preserve">Metodología (ajuste)</w:t>
+              <w:tab/>
+              <w:t xml:space="preserve">6</w:t>
+            </w:r>
+          </w:hyperlink>
+          <w:r>
+            <w:fldChar w:fldCharType="begin"/>
+            <w:instrText xml:space="preserve"> HYPERLINK \l "_heading=" </w:instrText>
+            <w:fldChar w:fldCharType="separate"/>
+          </w:r>
+          <w:r>
+            <w:rPr>
+              <w:rtl w:val="0"/>
+            </w:rPr>
+          </w:r>
+        </w:p>
+        <w:p>
+          <w:pPr>
+            <w:tabs>
+              <w:tab w:val="right" w:leader="none" w:pos="12000"/>
+            </w:tabs>
+            <w:spacing w:after="0" w:before="60" w:line="240" w:lineRule="auto"/>
+            <w:ind w:left="720" w:firstLine="0"/>
+            <w:rPr/>
+          </w:pPr>
+          <w:r>
+            <w:fldChar w:fldCharType="end"/>
+          </w:r>
+          <w:hyperlink w:anchor="_heading=h.yorfezcz">
+            <w:r>
+              <w:rPr>
+                <w:rFonts w:ascii="Arial" w:cs="Arial" w:eastAsia="Arial" w:hAnsi="Arial"/>
+                <w:b w:val="0"/>
+                <w:bCs w:val="0"/>
+                <w:i w:val="0"/>
+                <w:iCs w:val="0"/>
+                <w:smallCaps w:val="0"/>
+                <w:strike w:val="0"/>
+                <w:color w:val="000000"/>
+                <w:sz w:val="22"/>
+                <w:szCs w:val="22"/>
+                <w:u w:val="none"/>
+                <w:vertAlign w:val="baseline"/>
+                <w:rtl w:val="0"/>
+              </w:rPr>
+              <w:t xml:space="preserve">Evidencias de avance</w:t>
+              <w:tab/>
+              <w:t xml:space="preserve">6</w:t>
+            </w:r>
+          </w:hyperlink>
+          <w:r>
+            <w:fldChar w:fldCharType="begin"/>
+            <w:instrText xml:space="preserve"> HYPERLINK \l "_heading=" </w:instrText>
+            <w:fldChar w:fldCharType="separate"/>
+          </w:r>
+          <w:r>
+            <w:rPr>
+              <w:rtl w:val="0"/>
+            </w:rPr>
+          </w:r>
+        </w:p>
+        <w:p>
+          <w:pPr>
+            <w:tabs>
+              <w:tab w:val="right" w:leader="none" w:pos="12000"/>
+            </w:tabs>
+            <w:spacing w:after="0" w:before="60" w:line="240" w:lineRule="auto"/>
+            <w:ind w:left="360" w:firstLine="0"/>
+            <w:rPr/>
+          </w:pPr>
+          <w:r>
+            <w:fldChar w:fldCharType="end"/>
+          </w:r>
+          <w:hyperlink w:anchor="_heading=h.dvrwddor">
+            <w:r>
+              <w:rPr>
+                <w:rFonts w:ascii="Arial" w:cs="Arial" w:eastAsia="Arial" w:hAnsi="Arial"/>
+                <w:b w:val="0"/>
+                <w:bCs w:val="0"/>
+                <w:i w:val="0"/>
+                <w:iCs w:val="0"/>
+                <w:smallCaps w:val="0"/>
+                <w:strike w:val="0"/>
+                <w:color w:val="000000"/>
+                <w:sz w:val="22"/>
+                <w:szCs w:val="22"/>
+                <w:u w:val="none"/>
+                <w:vertAlign w:val="baseline"/>
+                <w:rtl w:val="0"/>
+              </w:rPr>
+              <w:t xml:space="preserve">2. Monitoreo del Plan de Trabajo</w:t>
+              <w:tab/>
+              <w:t xml:space="preserve">8</w:t>
+            </w:r>
+          </w:hyperlink>
+          <w:r>
+            <w:fldChar w:fldCharType="begin"/>
+            <w:instrText xml:space="preserve"> HYPERLINK \l "_heading=" </w:instrText>
+            <w:fldChar w:fldCharType="separate"/>
+          </w:r>
+          <w:r>
+            <w:rPr>
+              <w:rtl w:val="0"/>
+            </w:rPr>
+          </w:r>
+        </w:p>
+        <w:p>
+          <w:pPr>
+            <w:tabs>
+              <w:tab w:val="right" w:leader="none" w:pos="12000"/>
+            </w:tabs>
+            <w:spacing w:after="0" w:before="60" w:line="240" w:lineRule="auto"/>
+            <w:ind w:left="360" w:firstLine="0"/>
+            <w:rPr/>
+          </w:pPr>
+          <w:r>
+            <w:fldChar w:fldCharType="end"/>
+          </w:r>
+          <w:hyperlink w:anchor="_heading=h.wtxzedqy">
+            <w:r>
+              <w:rPr>
+                <w:rFonts w:ascii="Arial" w:cs="Arial" w:eastAsia="Arial" w:hAnsi="Arial"/>
+                <w:b w:val="0"/>
+                <w:bCs w:val="0"/>
+                <w:i w:val="0"/>
+                <w:iCs w:val="0"/>
+                <w:smallCaps w:val="0"/>
+                <w:strike w:val="0"/>
+                <w:color w:val="000000"/>
+                <w:sz w:val="22"/>
+                <w:szCs w:val="22"/>
+                <w:u w:val="none"/>
+                <w:vertAlign w:val="baseline"/>
+                <w:rtl w:val="0"/>
+              </w:rPr>
+              <w:t xml:space="preserve">3. Ajustes a partir del monitoreo</w:t>
+              <w:tab/>
+              <w:t xml:space="preserve">10</w:t>
+            </w:r>
+          </w:hyperlink>
+          <w:r>
+            <w:fldChar w:fldCharType="begin"/>
+            <w:instrText xml:space="preserve"> HYPERLINK \l "_heading=" </w:instrText>
+            <w:fldChar w:fldCharType="separate"/>
+          </w:r>
+          <w:r>
+            <w:rPr>
+              <w:rtl w:val="0"/>
+            </w:rPr>
+          </w:r>
+        </w:p>
+        <w:p>
+          <w:pPr>
+            <w:tabs>
+              <w:tab w:val="right" w:leader="none" w:pos="12000"/>
+            </w:tabs>
+            <w:spacing w:after="0" w:before="60" w:line="240" w:lineRule="auto"/>
+            <w:ind w:left="720" w:firstLine="0"/>
+            <w:rPr/>
+          </w:pPr>
+          <w:r>
+            <w:fldChar w:fldCharType="end"/>
+          </w:r>
+          <w:hyperlink w:anchor="_heading=h.ljqbrjes">
+            <w:r>
+              <w:rPr>
+                <w:rFonts w:ascii="Arial" w:cs="Arial" w:eastAsia="Arial" w:hAnsi="Arial"/>
+                <w:b w:val="0"/>
+                <w:bCs w:val="0"/>
+                <w:i w:val="0"/>
+                <w:iCs w:val="0"/>
+                <w:smallCaps w:val="0"/>
+                <w:strike w:val="0"/>
+                <w:color w:val="000000"/>
+                <w:sz w:val="22"/>
+                <w:szCs w:val="22"/>
+                <w:u w:val="none"/>
+                <w:vertAlign w:val="baseline"/>
+                <w:rtl w:val="0"/>
+              </w:rPr>
+              <w:t xml:space="preserve">Factores que han facilitado y/o dificultado el desarrollo</w:t>
+              <w:tab/>
+              <w:t xml:space="preserve">10</w:t>
+            </w:r>
+          </w:hyperlink>
+          <w:r>
+            <w:fldChar w:fldCharType="begin"/>
+            <w:instrText xml:space="preserve"> HYPERLINK \l "_heading=" </w:instrText>
+            <w:fldChar w:fldCharType="separate"/>
+          </w:r>
+          <w:r>
+            <w:rPr>
+              <w:rtl w:val="0"/>
+            </w:rPr>
+          </w:r>
+        </w:p>
+        <w:p>
+          <w:pPr>
+            <w:tabs>
+              <w:tab w:val="right" w:leader="none" w:pos="12000"/>
+            </w:tabs>
+            <w:spacing w:after="0" w:before="60" w:line="240" w:lineRule="auto"/>
+            <w:ind w:left="720" w:firstLine="0"/>
+            <w:rPr/>
+          </w:pPr>
+          <w:r>
+            <w:fldChar w:fldCharType="end"/>
+          </w:r>
+          <w:hyperlink w:anchor="_heading=h.ikxqohjr">
+            <w:r>
+              <w:rPr>
+                <w:rFonts w:ascii="Arial" w:cs="Arial" w:eastAsia="Arial" w:hAnsi="Arial"/>
+                <w:b w:val="0"/>
+                <w:bCs w:val="0"/>
+                <w:i w:val="0"/>
+                <w:iCs w:val="0"/>
+                <w:smallCaps w:val="0"/>
+                <w:strike w:val="0"/>
+                <w:color w:val="000000"/>
+                <w:sz w:val="22"/>
+                <w:szCs w:val="22"/>
+                <w:u w:val="none"/>
+                <w:vertAlign w:val="baseline"/>
+                <w:rtl w:val="0"/>
+              </w:rPr>
+              <w:t xml:space="preserve">Actividades ajustadas o eliminadas</w:t>
+              <w:tab/>
+              <w:t xml:space="preserve">11</w:t>
+            </w:r>
+          </w:hyperlink>
+          <w:r>
+            <w:fldChar w:fldCharType="begin"/>
+            <w:instrText xml:space="preserve"> HYPERLINK \l "_heading=" </w:instrText>
+            <w:fldChar w:fldCharType="separate"/>
+          </w:r>
+          <w:r>
+            <w:rPr>
+              <w:rtl w:val="0"/>
+            </w:rPr>
+          </w:r>
+        </w:p>
+        <w:p>
+          <w:pPr>
+            <w:tabs>
+              <w:tab w:val="right" w:leader="none" w:pos="12000"/>
+            </w:tabs>
+            <w:spacing w:after="0" w:before="60" w:line="240" w:lineRule="auto"/>
+            <w:ind w:left="720" w:firstLine="0"/>
+            <w:rPr/>
+          </w:pPr>
+          <w:r>
+            <w:fldChar w:fldCharType="end"/>
+          </w:r>
+          <w:hyperlink w:anchor="_heading=h.ebakwges">
+            <w:r>
+              <w:rPr>
+                <w:rFonts w:ascii="Arial" w:cs="Arial" w:eastAsia="Arial" w:hAnsi="Arial"/>
+                <w:b w:val="0"/>
+                <w:bCs w:val="0"/>
+                <w:i w:val="0"/>
+                <w:iCs w:val="0"/>
+                <w:smallCaps w:val="0"/>
+                <w:strike w:val="0"/>
+                <w:color w:val="000000"/>
+                <w:sz w:val="22"/>
+                <w:szCs w:val="22"/>
+                <w:u w:val="none"/>
+                <w:vertAlign w:val="baseline"/>
+                <w:rtl w:val="0"/>
+              </w:rPr>
+              <w:t xml:space="preserve">Actividades no iniciadas o retrasadas</w:t>
+              <w:tab/>
+              <w:t xml:space="preserve">12</w:t>
+            </w:r>
+          </w:hyperlink>
+          <w:r>
+            <w:fldChar w:fldCharType="begin"/>
+            <w:instrText xml:space="preserve"> HYPERLINK \l "_heading=" </w:instrText>
+            <w:fldChar w:fldCharType="separate"/>
+          </w:r>
           <w:r>
             <w:rPr>
               <w:rtl w:val="0"/>
@@ -344,20 +780,33 @@
           <w:pPr>
             <w:widowControl w:val="0"/>
             <w:tabs>
-              <w:tab w:val="right" w:leader="dot" w:pos="12000"/>
+              <w:tab w:val="right" w:leader="none" w:pos="12000"/>
             </w:tabs>
             <w:spacing w:after="0" w:before="60" w:line="240" w:lineRule="auto"/>
+            <w:ind w:left="360" w:firstLine="0"/>
             <w:rPr>
-              <w:b w:val="1"/>
-              <w:bCs w:val="1"/>
+              <w:rFonts w:ascii="Arial" w:cs="Arial" w:eastAsia="Arial" w:hAnsi="Arial"/>
+              <w:b w:val="0"/>
+              <w:bCs w:val="0"/>
+              <w:i w:val="0"/>
+              <w:iCs w:val="0"/>
+              <w:smallCaps w:val="0"/>
+              <w:strike w:val="0"/>
               <w:color w:val="000000"/>
+              <w:sz w:val="22"/>
+              <w:szCs w:val="22"/>
               <w:u w:val="none"/>
+              <w:shd w:fill="auto" w:val="clear"/>
+              <w:vertAlign w:val="baseline"/>
             </w:rPr>
           </w:pPr>
-          <w:hyperlink w:anchor="_heading=">
-            <w:r>
-              <w:rPr>
-                <w:rFonts w:ascii="Calibri" w:cs="Calibri" w:eastAsia="Calibri" w:hAnsi="Calibri"/>
+          <w:r>
+            <w:fldChar w:fldCharType="end"/>
+          </w:r>
+          <w:hyperlink w:anchor="_heading=h.bglxgmks">
+            <w:r>
+              <w:rPr>
+                <w:rFonts w:ascii="Arial" w:cs="Arial" w:eastAsia="Arial" w:hAnsi="Arial"/>
                 <w:b w:val="0"/>
                 <w:bCs w:val="0"/>
                 <w:i w:val="0"/>
@@ -368,475 +817,12 @@
                 <w:sz w:val="22"/>
                 <w:szCs w:val="22"/>
                 <w:u w:val="none"/>
-                <w:shd w:fill="auto" w:val="clear"/>
-                <w:vertAlign w:val="baseline"/>
-                <w:rtl w:val="0"/>
-              </w:rPr>
-              <w:t xml:space="preserve">Guía 2. Desarrollo Proyecto APT — Informe de Avance (Fase 2)</w:t>
-              <w:tab/>
-              <w:t xml:space="preserve">2</w:t>
-            </w:r>
-          </w:hyperlink>
-          <w:r>
-            <w:rPr>
-              <w:rtl w:val="0"/>
-            </w:rPr>
-          </w:r>
-        </w:p>
-        <w:p>
-          <w:pPr>
-            <w:widowControl w:val="0"/>
-            <w:tabs>
-              <w:tab w:val="right" w:leader="dot" w:pos="12000"/>
-            </w:tabs>
-            <w:spacing w:after="0" w:before="60" w:line="240" w:lineRule="auto"/>
-            <w:ind w:left="360" w:firstLine="0"/>
-            <w:rPr>
-              <w:color w:val="000000"/>
-              <w:u w:val="none"/>
-            </w:rPr>
-          </w:pPr>
-          <w:hyperlink w:anchor="_heading=">
-            <w:r>
-              <w:rPr>
-                <w:rFonts w:ascii="Calibri" w:cs="Calibri" w:eastAsia="Calibri" w:hAnsi="Calibri"/>
-                <w:b w:val="0"/>
-                <w:bCs w:val="0"/>
-                <w:i w:val="0"/>
-                <w:iCs w:val="0"/>
-                <w:smallCaps w:val="0"/>
-                <w:strike w:val="0"/>
-                <w:color w:val="000000"/>
-                <w:sz w:val="22"/>
-                <w:szCs w:val="22"/>
-                <w:u w:val="none"/>
-                <w:shd w:fill="auto" w:val="clear"/>
-                <w:vertAlign w:val="baseline"/>
-                <w:rtl w:val="0"/>
-              </w:rPr>
-              <w:t xml:space="preserve">1. Resumen de avance del Proyecto APT</w:t>
-              <w:tab/>
-              <w:t xml:space="preserve">2</w:t>
-            </w:r>
-          </w:hyperlink>
-          <w:r>
-            <w:rPr>
-              <w:rtl w:val="0"/>
-            </w:rPr>
-          </w:r>
-        </w:p>
-        <w:p>
-          <w:pPr>
-            <w:widowControl w:val="0"/>
-            <w:tabs>
-              <w:tab w:val="right" w:leader="dot" w:pos="12000"/>
-            </w:tabs>
-            <w:spacing w:after="0" w:before="60" w:line="240" w:lineRule="auto"/>
-            <w:ind w:left="720" w:firstLine="0"/>
-            <w:rPr>
-              <w:color w:val="000000"/>
-              <w:u w:val="none"/>
-            </w:rPr>
-          </w:pPr>
-          <w:hyperlink w:anchor="_heading=">
-            <w:r>
-              <w:rPr>
-                <w:rFonts w:ascii="Calibri" w:cs="Calibri" w:eastAsia="Calibri" w:hAnsi="Calibri"/>
-                <w:b w:val="0"/>
-                <w:bCs w:val="0"/>
-                <w:i w:val="0"/>
-                <w:iCs w:val="0"/>
-                <w:smallCaps w:val="0"/>
-                <w:strike w:val="0"/>
-                <w:color w:val="000000"/>
-                <w:sz w:val="22"/>
-                <w:szCs w:val="22"/>
-                <w:u w:val="none"/>
-                <w:shd w:fill="auto" w:val="clear"/>
-                <w:vertAlign w:val="baseline"/>
-                <w:rtl w:val="0"/>
-              </w:rPr>
-              <w:t xml:space="preserve">Objetivos (ajuste)</w:t>
-              <w:tab/>
-              <w:t xml:space="preserve">4</w:t>
-            </w:r>
-          </w:hyperlink>
-          <w:r>
-            <w:rPr>
-              <w:rtl w:val="0"/>
-            </w:rPr>
-          </w:r>
-        </w:p>
-        <w:p>
-          <w:pPr>
-            <w:widowControl w:val="0"/>
-            <w:tabs>
-              <w:tab w:val="right" w:leader="dot" w:pos="12000"/>
-            </w:tabs>
-            <w:spacing w:after="0" w:before="60" w:line="240" w:lineRule="auto"/>
-            <w:ind w:left="720" w:firstLine="0"/>
-            <w:rPr>
-              <w:color w:val="000000"/>
-              <w:u w:val="none"/>
-            </w:rPr>
-          </w:pPr>
-          <w:hyperlink w:anchor="_heading=">
-            <w:r>
-              <w:rPr>
-                <w:rFonts w:ascii="Calibri" w:cs="Calibri" w:eastAsia="Calibri" w:hAnsi="Calibri"/>
-                <w:b w:val="0"/>
-                <w:bCs w:val="0"/>
-                <w:i w:val="0"/>
-                <w:iCs w:val="0"/>
-                <w:smallCaps w:val="0"/>
-                <w:strike w:val="0"/>
-                <w:color w:val="000000"/>
-                <w:sz w:val="22"/>
-                <w:szCs w:val="22"/>
-                <w:u w:val="none"/>
-                <w:shd w:fill="auto" w:val="clear"/>
-                <w:vertAlign w:val="baseline"/>
-                <w:rtl w:val="0"/>
-              </w:rPr>
-              <w:t xml:space="preserve">Metodología (ajuste)</w:t>
-              <w:tab/>
-              <w:t xml:space="preserve">5</w:t>
-            </w:r>
-          </w:hyperlink>
-          <w:r>
-            <w:rPr>
-              <w:rtl w:val="0"/>
-            </w:rPr>
-          </w:r>
-        </w:p>
-        <w:p>
-          <w:pPr>
-            <w:widowControl w:val="0"/>
-            <w:tabs>
-              <w:tab w:val="right" w:leader="dot" w:pos="12000"/>
-            </w:tabs>
-            <w:spacing w:after="0" w:before="60" w:line="240" w:lineRule="auto"/>
-            <w:ind w:left="720" w:firstLine="0"/>
-            <w:rPr>
-              <w:color w:val="000000"/>
-              <w:u w:val="none"/>
-            </w:rPr>
-          </w:pPr>
-          <w:hyperlink w:anchor="_heading=">
-            <w:r>
-              <w:rPr>
-                <w:rFonts w:ascii="Calibri" w:cs="Calibri" w:eastAsia="Calibri" w:hAnsi="Calibri"/>
-                <w:b w:val="0"/>
-                <w:bCs w:val="0"/>
-                <w:i w:val="0"/>
-                <w:iCs w:val="0"/>
-                <w:smallCaps w:val="0"/>
-                <w:strike w:val="0"/>
-                <w:color w:val="000000"/>
-                <w:sz w:val="22"/>
-                <w:szCs w:val="22"/>
-                <w:u w:val="none"/>
-                <w:shd w:fill="auto" w:val="clear"/>
-                <w:vertAlign w:val="baseline"/>
-                <w:rtl w:val="0"/>
-              </w:rPr>
-              <w:t xml:space="preserve">Evidencias de avance</w:t>
-              <w:tab/>
-              <w:t xml:space="preserve">5</w:t>
-            </w:r>
-          </w:hyperlink>
-          <w:r>
-            <w:rPr>
-              <w:rtl w:val="0"/>
-            </w:rPr>
-          </w:r>
-        </w:p>
-        <w:p>
-          <w:pPr>
-            <w:widowControl w:val="0"/>
-            <w:tabs>
-              <w:tab w:val="right" w:leader="dot" w:pos="12000"/>
-            </w:tabs>
-            <w:spacing w:after="0" w:before="60" w:line="240" w:lineRule="auto"/>
-            <w:ind w:left="360" w:firstLine="0"/>
-            <w:rPr>
-              <w:color w:val="000000"/>
-              <w:u w:val="none"/>
-            </w:rPr>
-          </w:pPr>
-          <w:hyperlink w:anchor="_heading=">
-            <w:r>
-              <w:rPr>
-                <w:rFonts w:ascii="Calibri" w:cs="Calibri" w:eastAsia="Calibri" w:hAnsi="Calibri"/>
-                <w:b w:val="0"/>
-                <w:bCs w:val="0"/>
-                <w:i w:val="0"/>
-                <w:iCs w:val="0"/>
-                <w:smallCaps w:val="0"/>
-                <w:strike w:val="0"/>
-                <w:color w:val="000000"/>
-                <w:sz w:val="22"/>
-                <w:szCs w:val="22"/>
-                <w:u w:val="none"/>
-                <w:shd w:fill="auto" w:val="clear"/>
-                <w:vertAlign w:val="baseline"/>
-                <w:rtl w:val="0"/>
-              </w:rPr>
-              <w:t xml:space="preserve">2. Monitoreo del Plan de Trabajo</w:t>
-              <w:tab/>
-              <w:t xml:space="preserve">7</w:t>
-            </w:r>
-          </w:hyperlink>
-          <w:r>
-            <w:rPr>
-              <w:rtl w:val="0"/>
-            </w:rPr>
-          </w:r>
-        </w:p>
-        <w:p>
-          <w:pPr>
-            <w:widowControl w:val="0"/>
-            <w:tabs>
-              <w:tab w:val="right" w:leader="dot" w:pos="12000"/>
-            </w:tabs>
-            <w:spacing w:after="0" w:before="60" w:line="240" w:lineRule="auto"/>
-            <w:ind w:left="360" w:firstLine="0"/>
-            <w:rPr>
-              <w:color w:val="000000"/>
-              <w:u w:val="none"/>
-            </w:rPr>
-          </w:pPr>
-          <w:hyperlink w:anchor="_heading=">
-            <w:r>
-              <w:rPr>
-                <w:rFonts w:ascii="Calibri" w:cs="Calibri" w:eastAsia="Calibri" w:hAnsi="Calibri"/>
-                <w:b w:val="0"/>
-                <w:bCs w:val="0"/>
-                <w:i w:val="0"/>
-                <w:iCs w:val="0"/>
-                <w:smallCaps w:val="0"/>
-                <w:strike w:val="0"/>
-                <w:color w:val="000000"/>
-                <w:sz w:val="22"/>
-                <w:szCs w:val="22"/>
-                <w:u w:val="none"/>
-                <w:shd w:fill="auto" w:val="clear"/>
-                <w:vertAlign w:val="baseline"/>
-                <w:rtl w:val="0"/>
-              </w:rPr>
-              <w:t xml:space="preserve">3. Ajustes a partir del monitoreo</w:t>
-              <w:tab/>
-              <w:t xml:space="preserve">9</w:t>
-            </w:r>
-          </w:hyperlink>
-          <w:r>
-            <w:rPr>
-              <w:rtl w:val="0"/>
-            </w:rPr>
-          </w:r>
-        </w:p>
-        <w:p>
-          <w:pPr>
-            <w:widowControl w:val="0"/>
-            <w:tabs>
-              <w:tab w:val="right" w:leader="dot" w:pos="12000"/>
-            </w:tabs>
-            <w:spacing w:after="0" w:before="60" w:line="240" w:lineRule="auto"/>
-            <w:ind w:left="720" w:firstLine="0"/>
-            <w:rPr>
-              <w:color w:val="000000"/>
-              <w:u w:val="none"/>
-            </w:rPr>
-          </w:pPr>
-          <w:hyperlink w:anchor="_heading=">
-            <w:r>
-              <w:rPr>
-                <w:rFonts w:ascii="Calibri" w:cs="Calibri" w:eastAsia="Calibri" w:hAnsi="Calibri"/>
-                <w:b w:val="0"/>
-                <w:bCs w:val="0"/>
-                <w:i w:val="0"/>
-                <w:iCs w:val="0"/>
-                <w:smallCaps w:val="0"/>
-                <w:strike w:val="0"/>
-                <w:color w:val="000000"/>
-                <w:sz w:val="22"/>
-                <w:szCs w:val="22"/>
-                <w:u w:val="none"/>
-                <w:shd w:fill="auto" w:val="clear"/>
-                <w:vertAlign w:val="baseline"/>
-                <w:rtl w:val="0"/>
-              </w:rPr>
-              <w:t xml:space="preserve">Factores que han facilitado y/o dificultado el desarrollo</w:t>
-              <w:tab/>
-              <w:t xml:space="preserve">9</w:t>
-            </w:r>
-          </w:hyperlink>
-          <w:r>
-            <w:rPr>
-              <w:rtl w:val="0"/>
-            </w:rPr>
-          </w:r>
-        </w:p>
-        <w:p>
-          <w:pPr>
-            <w:widowControl w:val="0"/>
-            <w:tabs>
-              <w:tab w:val="right" w:leader="dot" w:pos="12000"/>
-            </w:tabs>
-            <w:spacing w:after="0" w:before="60" w:line="240" w:lineRule="auto"/>
-            <w:ind w:left="720" w:firstLine="0"/>
-            <w:rPr>
-              <w:color w:val="000000"/>
-              <w:u w:val="none"/>
-            </w:rPr>
-          </w:pPr>
-          <w:hyperlink w:anchor="_heading=">
-            <w:r>
-              <w:rPr>
-                <w:rFonts w:ascii="Calibri" w:cs="Calibri" w:eastAsia="Calibri" w:hAnsi="Calibri"/>
-                <w:b w:val="0"/>
-                <w:bCs w:val="0"/>
-                <w:i w:val="0"/>
-                <w:iCs w:val="0"/>
-                <w:smallCaps w:val="0"/>
-                <w:strike w:val="0"/>
-                <w:color w:val="000000"/>
-                <w:sz w:val="22"/>
-                <w:szCs w:val="22"/>
-                <w:u w:val="none"/>
-                <w:shd w:fill="auto" w:val="clear"/>
-                <w:vertAlign w:val="baseline"/>
-                <w:rtl w:val="0"/>
-              </w:rPr>
-              <w:t xml:space="preserve">Actividades ajustadas o eliminadas</w:t>
-              <w:tab/>
-              <w:t xml:space="preserve">10</w:t>
-            </w:r>
-          </w:hyperlink>
-          <w:r>
-            <w:rPr>
-              <w:rtl w:val="0"/>
-            </w:rPr>
-          </w:r>
-        </w:p>
-        <w:p>
-          <w:pPr>
-            <w:widowControl w:val="0"/>
-            <w:tabs>
-              <w:tab w:val="right" w:leader="dot" w:pos="12000"/>
-            </w:tabs>
-            <w:spacing w:after="0" w:before="60" w:line="240" w:lineRule="auto"/>
-            <w:ind w:left="720" w:firstLine="0"/>
-            <w:rPr>
-              <w:color w:val="000000"/>
-              <w:u w:val="none"/>
-            </w:rPr>
-          </w:pPr>
-          <w:hyperlink w:anchor="_heading=">
-            <w:r>
-              <w:rPr>
-                <w:rFonts w:ascii="Calibri" w:cs="Calibri" w:eastAsia="Calibri" w:hAnsi="Calibri"/>
-                <w:b w:val="0"/>
-                <w:bCs w:val="0"/>
-                <w:i w:val="0"/>
-                <w:iCs w:val="0"/>
-                <w:smallCaps w:val="0"/>
-                <w:strike w:val="0"/>
-                <w:color w:val="000000"/>
-                <w:sz w:val="22"/>
-                <w:szCs w:val="22"/>
-                <w:u w:val="none"/>
-                <w:shd w:fill="auto" w:val="clear"/>
-                <w:vertAlign w:val="baseline"/>
-                <w:rtl w:val="0"/>
-              </w:rPr>
-              <w:t xml:space="preserve">Actividades no iniciadas o retrasadas</w:t>
-              <w:tab/>
-              <w:t xml:space="preserve">11</w:t>
-            </w:r>
-          </w:hyperlink>
-          <w:r>
-            <w:rPr>
-              <w:rtl w:val="0"/>
-            </w:rPr>
-          </w:r>
-        </w:p>
-        <w:p>
-          <w:pPr>
-            <w:widowControl w:val="0"/>
-            <w:tabs>
-              <w:tab w:val="right" w:leader="dot" w:pos="12000"/>
-            </w:tabs>
-            <w:spacing w:after="0" w:before="60" w:line="240" w:lineRule="auto"/>
-            <w:ind w:left="720" w:firstLine="0"/>
-            <w:rPr>
-              <w:color w:val="000000"/>
-              <w:u w:val="none"/>
-            </w:rPr>
-          </w:pPr>
-          <w:hyperlink w:anchor="_heading=">
-            <w:r>
-              <w:rPr>
-                <w:rFonts w:ascii="Calibri" w:cs="Calibri" w:eastAsia="Calibri" w:hAnsi="Calibri"/>
-                <w:b w:val="0"/>
-                <w:bCs w:val="0"/>
-                <w:i w:val="0"/>
-                <w:iCs w:val="0"/>
-                <w:smallCaps w:val="0"/>
-                <w:strike w:val="0"/>
-                <w:color w:val="000000"/>
-                <w:sz w:val="22"/>
-                <w:szCs w:val="22"/>
-                <w:u w:val="none"/>
-                <w:shd w:fill="auto" w:val="clear"/>
-                <w:vertAlign w:val="baseline"/>
-                <w:rtl w:val="0"/>
-              </w:rPr>
-              <w:t xml:space="preserve">Pendiente de consolidación en el repositorio</w:t>
-              <w:tab/>
-              <w:t xml:space="preserve">11</w:t>
-            </w:r>
-          </w:hyperlink>
-          <w:r>
-            <w:rPr>
-              <w:rtl w:val="0"/>
-            </w:rPr>
-          </w:r>
-        </w:p>
-        <w:p>
-          <w:pPr>
-            <w:widowControl w:val="0"/>
-            <w:tabs>
-              <w:tab w:val="right" w:leader="dot" w:pos="12000"/>
-            </w:tabs>
-            <w:spacing w:after="0" w:before="60" w:line="240" w:lineRule="auto"/>
-            <w:ind w:left="360" w:firstLine="0"/>
-            <w:rPr>
-              <w:color w:val="000000"/>
-              <w:u w:val="none"/>
-            </w:rPr>
-          </w:pPr>
-          <w:hyperlink w:anchor="_heading=">
-            <w:r>
-              <w:rPr>
-                <w:rFonts w:ascii="Calibri" w:cs="Calibri" w:eastAsia="Calibri" w:hAnsi="Calibri"/>
-                <w:b w:val="0"/>
-                <w:bCs w:val="0"/>
-                <w:i w:val="0"/>
-                <w:iCs w:val="0"/>
-                <w:smallCaps w:val="0"/>
-                <w:strike w:val="0"/>
-                <w:color w:val="000000"/>
-                <w:sz w:val="22"/>
-                <w:szCs w:val="22"/>
-                <w:u w:val="none"/>
-                <w:shd w:fill="auto" w:val="clear"/>
                 <w:vertAlign w:val="baseline"/>
                 <w:rtl w:val="0"/>
               </w:rPr>
               <w:t xml:space="preserve">4. Síntesis de congruencia con la Fase 1</w:t>
               <w:tab/>
-              <w:t xml:space="preserve">11</w:t>
+              <w:t xml:space="preserve">12</w:t>
             </w:r>
           </w:hyperlink>
           <w:r>
@@ -852,11 +838,7 @@
     </w:sdt>
     <w:p>
       <w:pPr>
-        <w:pStyle w:val="Heading1"/>
-        <w:rPr>
-          <w:sz w:val="22"/>
-          <w:szCs w:val="22"/>
-        </w:rPr>
+        <w:rPr/>
       </w:pPr>
       <w:r>
         <w:rPr>
@@ -866,30 +848,27 @@
     </w:p>
     <w:p>
       <w:pPr>
-        <w:pStyle w:val="Heading1"/>
-        <w:spacing w:before="0" w:lineRule="auto"/>
-        <w:jc w:val="center"/>
         <w:rPr/>
       </w:pPr>
-      <w:bookmarkStart w:colFirst="0" w:colLast="0" w:name="_heading=h.7o4gsj769o9y" w:id="2"/>
-      <w:bookmarkEnd w:id="2"/>
-      <w:r>
-        <w:rPr>
-          <w:rtl w:val="0"/>
-        </w:rPr>
-        <w:t xml:space="preserve"> </w:t>
+      <w:r>
+        <w:br w:type="page"/>
+      </w:r>
+      <w:r>
+        <w:rPr>
+          <w:rtl w:val="0"/>
+        </w:rPr>
       </w:r>
     </w:p>
     <w:p>
       <w:pPr>
         <w:pStyle w:val="Heading1"/>
-        <w:jc w:val="center"/>
         <w:rPr/>
       </w:pPr>
       <w:r>
         <w:rPr>
           <w:rtl w:val="0"/>
         </w:rPr>
+        <w:t xml:space="preserve">Guía 2. Desarrollo Proyecto APT — Informe de Avance (Fase 2)</w:t>
       </w:r>
     </w:p>
     <w:p>
@@ -898,8 +877,17 @@
       </w:pPr>
       <w:r>
         <w:rPr>
-          <w:rtl w:val="0"/>
-        </w:rPr>
+          <w:b w:val="1"/>
+          <w:bCs w:val="1"/>
+          <w:rtl w:val="0"/>
+        </w:rPr>
+        <w:t xml:space="preserve">Asignatura:</w:t>
+      </w:r>
+      <w:r>
+        <w:rPr>
+          <w:rtl w:val="0"/>
+        </w:rPr>
+        <w:t xml:space="preserve"> Capstone · PTY4614</w:t>
       </w:r>
     </w:p>
     <w:p>
@@ -908,8 +896,17 @@
       </w:pPr>
       <w:r>
         <w:rPr>
-          <w:rtl w:val="0"/>
-        </w:rPr>
+          <w:b w:val="1"/>
+          <w:bCs w:val="1"/>
+          <w:rtl w:val="0"/>
+        </w:rPr>
+        <w:t xml:space="preserve">Proyecto:</w:t>
+      </w:r>
+      <w:r>
+        <w:rPr>
+          <w:rtl w:val="0"/>
+        </w:rPr>
+        <w:t xml:space="preserve"> AgeCare — Plataforma digital integral de cuidado de adultos mayores</w:t>
       </w:r>
     </w:p>
     <w:p>
@@ -918,8 +915,17 @@
       </w:pPr>
       <w:r>
         <w:rPr>
-          <w:rtl w:val="0"/>
-        </w:rPr>
+          <w:b w:val="1"/>
+          <w:bCs w:val="1"/>
+          <w:rtl w:val="0"/>
+        </w:rPr>
+        <w:t xml:space="preserve">Equipo:</w:t>
+      </w:r>
+      <w:r>
+        <w:rPr>
+          <w:rtl w:val="0"/>
+        </w:rPr>
+        <w:t xml:space="preserve"> Javier Cerna Chávez · Benjamín Camus · Juan Mora</w:t>
       </w:r>
     </w:p>
     <w:p>
@@ -928,8 +934,31 @@
       </w:pPr>
       <w:r>
         <w:rPr>
-          <w:rtl w:val="0"/>
-        </w:rPr>
+          <w:b w:val="1"/>
+          <w:bCs w:val="1"/>
+          <w:rtl w:val="0"/>
+        </w:rPr>
+        <w:t xml:space="preserve">Carrera:</w:t>
+      </w:r>
+      <w:r>
+        <w:rPr>
+          <w:rtl w:val="0"/>
+        </w:rPr>
+        <w:t xml:space="preserve"> Ingeniería en Informática · </w:t>
+      </w:r>
+      <w:r>
+        <w:rPr>
+          <w:b w:val="1"/>
+          <w:bCs w:val="1"/>
+          <w:rtl w:val="0"/>
+        </w:rPr>
+        <w:t xml:space="preserve">Sede:</w:t>
+      </w:r>
+      <w:r>
+        <w:rPr>
+          <w:rtl w:val="0"/>
+        </w:rPr>
+        <w:t xml:space="preserve"> San Andrés</w:t>
       </w:r>
     </w:p>
     <w:p>
@@ -938,81 +967,17 @@
       </w:pPr>
       <w:r>
         <w:rPr>
-          <w:rtl w:val="0"/>
-        </w:rPr>
-      </w:r>
-    </w:p>
-    <w:p>
-      <w:pPr>
-        <w:rPr/>
-      </w:pPr>
-      <w:r>
-        <w:rPr>
-          <w:rtl w:val="0"/>
-        </w:rPr>
-      </w:r>
-    </w:p>
-    <w:p>
-      <w:pPr>
-        <w:rPr/>
-      </w:pPr>
-      <w:r>
-        <w:rPr>
-          <w:rtl w:val="0"/>
-        </w:rPr>
-      </w:r>
-    </w:p>
-    <w:p>
-      <w:pPr>
-        <w:rPr/>
-      </w:pPr>
-      <w:r>
-        <w:rPr>
-          <w:rtl w:val="0"/>
-        </w:rPr>
-      </w:r>
-    </w:p>
-    <w:p>
-      <w:pPr>
-        <w:rPr/>
-      </w:pPr>
-      <w:r>
-        <w:rPr>
-          <w:rtl w:val="0"/>
-        </w:rPr>
-      </w:r>
-    </w:p>
-    <w:p>
-      <w:pPr>
-        <w:pStyle w:val="Heading1"/>
-        <w:rPr/>
-      </w:pPr>
-      <w:r>
-        <w:rPr>
-          <w:rtl w:val="0"/>
-        </w:rPr>
-      </w:r>
-    </w:p>
-    <w:p>
-      <w:pPr>
-        <w:pStyle w:val="Heading1"/>
-        <w:rPr/>
-      </w:pPr>
-      <w:r>
-        <w:rPr>
-          <w:rtl w:val="0"/>
-        </w:rPr>
-        <w:t xml:space="preserve">Guía 2. Desarrollo Proyecto APT — Informe de Avance (Fase 2)</w:t>
-      </w:r>
-    </w:p>
-    <w:p>
-      <w:pPr>
-        <w:rPr/>
-      </w:pPr>
-      <w:r>
-        <w:rPr>
-          <w:rtl w:val="0"/>
-        </w:rPr>
+          <w:b w:val="1"/>
+          <w:bCs w:val="1"/>
+          <w:rtl w:val="0"/>
+        </w:rPr>
+        <w:t xml:space="preserve">Metodología:</w:t>
+      </w:r>
+      <w:r>
+        <w:rPr>
+          <w:rtl w:val="0"/>
+        </w:rPr>
+        <w:t xml:space="preserve"> Enfoque Tradicional (Cascada)</w:t>
       </w:r>
     </w:p>
     <w:p>
@@ -1086,6 +1051,21 @@
         <w:rPr>
           <w:rtl w:val="0"/>
         </w:rPr>
+        <w:t xml:space="preserve">Durante esta fase el equipo ejecutó las etapas de </w:t>
+      </w:r>
+      <w:r>
+        <w:rPr>
+          <w:b w:val="1"/>
+          <w:bCs w:val="1"/>
+          <w:rtl w:val="0"/>
+        </w:rPr>
+        <w:t xml:space="preserve">Análisis y Definición de Requisitos</w:t>
+      </w:r>
+      <w:r>
+        <w:rPr>
+          <w:rtl w:val="0"/>
+        </w:rPr>
+        <w:t xml:space="preserve"> y</w:t>
       </w:r>
     </w:p>
     <w:p>
@@ -1094,23 +1074,31 @@
       </w:pPr>
       <w:r>
         <w:rPr>
-          <w:rtl w:val="0"/>
-        </w:rPr>
-        <w:t xml:space="preserve">Durante esta fase el equipo ejecuta las etapas de </w:t>
-      </w:r>
-      <w:r>
-        <w:rPr>
           <w:b w:val="1"/>
           <w:bCs w:val="1"/>
           <w:rtl w:val="0"/>
         </w:rPr>
-        <w:t xml:space="preserve">Análisis y Definición de Requisitos</w:t>
-      </w:r>
-      <w:r>
-        <w:rPr>
-          <w:rtl w:val="0"/>
-        </w:rPr>
-        <w:t xml:space="preserve"> y</w:t>
+        <w:t xml:space="preserve">Diseño del Sistema</w:t>
+      </w:r>
+      <w:r>
+        <w:rPr>
+          <w:rtl w:val="0"/>
+        </w:rPr>
+        <w:t xml:space="preserve"> del plan en cascada, y dio inicio a la </w:t>
+      </w:r>
+      <w:r>
+        <w:rPr>
+          <w:b w:val="1"/>
+          <w:bCs w:val="1"/>
+          <w:rtl w:val="0"/>
+        </w:rPr>
+        <w:t xml:space="preserve">Implementación</w:t>
+      </w:r>
+      <w:r>
+        <w:rPr>
+          <w:rtl w:val="0"/>
+        </w:rPr>
+        <w:t xml:space="preserve">.</w:t>
       </w:r>
     </w:p>
     <w:p>
@@ -1123,13 +1111,26 @@
           <w:bCs w:val="1"/>
           <w:rtl w:val="0"/>
         </w:rPr>
-        <w:t xml:space="preserve">Diseño del Sistema</w:t>
-      </w:r>
-      <w:r>
-        <w:rPr>
-          <w:rtl w:val="0"/>
-        </w:rPr>
-        <w:t xml:space="preserve"> del plan en cascada, y dio inicio a la </w:t>
+        <w:t xml:space="preserve">Alcance del proyecto y su doble contexto.</w:t>
+      </w:r>
+      <w:r>
+        <w:rPr>
+          <w:rtl w:val="0"/>
+        </w:rPr>
+        <w:t xml:space="preserve"> El Proyecto APT se desarrolla como una **solución full stack** completa (backend en FastAPI + base de datos PostgreSQL + aplicación móvil en Flutter con las vistas de los tres roles), tal como lo exige el perfil de egreso y lo refleja el cronograma en cascada de la Fase 1 (etapas de backend en S7–S11 y de frontend móvil en S12–S14).</w:t>
+      </w:r>
+    </w:p>
+    <w:p>
+      <w:pPr>
+        <w:rPr/>
+      </w:pPr>
+      <w:r>
+        <w:rPr>
+          <w:rtl w:val="0"/>
+        </w:rPr>
+        <w:t xml:space="preserve">Este alcance full stack es el que se entrega y evalúa en el marco académico de DUOC UC.</w:t>
+        <w:br w:type="textWrapping"/>
+        <w:t xml:space="preserve">En paralelo, el equipo colabora con la empresa </w:t>
       </w:r>
       <w:r>
         <w:rPr>
@@ -1137,13 +1138,43 @@
           <w:bCs w:val="1"/>
           <w:rtl w:val="0"/>
         </w:rPr>
-        <w:t xml:space="preserve">implementación</w:t>
-      </w:r>
-      <w:r>
-        <w:rPr>
-          <w:rtl w:val="0"/>
-        </w:rPr>
-        <w:t xml:space="preserve">.</w:t>
+        <w:t xml:space="preserve">Alloxentric</w:t>
+      </w:r>
+      <w:r>
+        <w:rPr>
+          <w:rtl w:val="0"/>
+        </w:rPr>
+        <w:t xml:space="preserve"> —de la cual proviene la</w:t>
+        <w:br w:type="textWrapping"/>
+        <w:t xml:space="preserve"> especificación funcional del producto—, aportando principalmente el desarrollo del **backend y la base de datos** que dan servicio a todos los roles. Esta relación con una contraparte real es la que justifica dos decisiones de Fase 1: el uso de una </w:t>
+      </w:r>
+      <w:r>
+        <w:rPr>
+          <w:b w:val="1"/>
+          <w:bCs w:val="1"/>
+          <w:rtl w:val="0"/>
+        </w:rPr>
+        <w:t xml:space="preserve">metodología en cascada</w:t>
+      </w:r>
+      <w:r>
+        <w:rPr>
+          <w:rtl w:val="0"/>
+        </w:rPr>
+        <w:t xml:space="preserve"> (los requisitos llegan estables y documentados desde la empresa) y el </w:t>
+      </w:r>
+      <w:r>
+        <w:rPr>
+          <w:b w:val="1"/>
+          <w:bCs w:val="1"/>
+          <w:rtl w:val="0"/>
+        </w:rPr>
+        <w:t xml:space="preserve">cronograma secuencial</w:t>
+      </w:r>
+      <w:r>
+        <w:rPr>
+          <w:rtl w:val="0"/>
+        </w:rPr>
+        <w:t xml:space="preserve"> que primero asienta el núcleo de datos y backend, y luego construye la capa de presentación.</w:t>
       </w:r>
     </w:p>
     <w:p>
@@ -1152,187 +1183,16 @@
       </w:pPr>
       <w:r>
         <w:rPr>
+          <w:rtl w:val="0"/>
+        </w:rPr>
+        <w:t xml:space="preserve">El avance de esta fecha se concentra, por tanto, en las capas de </w:t>
+      </w:r>
+      <w:r>
+        <w:rPr>
           <w:b w:val="1"/>
           <w:bCs w:val="1"/>
           <w:rtl w:val="0"/>
         </w:rPr>
-        <w:t xml:space="preserve">Alcance del proyecto y su doble contexto.</w:t>
-      </w:r>
-      <w:r>
-        <w:rPr>
-          <w:rtl w:val="0"/>
-        </w:rPr>
-        <w:t xml:space="preserve"> El Proyecto APT se desarrolla como una **solución</w:t>
-      </w:r>
-    </w:p>
-    <w:p>
-      <w:pPr>
-        <w:rPr/>
-      </w:pPr>
-      <w:r>
-        <w:rPr>
-          <w:rtl w:val="0"/>
-        </w:rPr>
-        <w:t xml:space="preserve">full stack** completa (backend en Fast API + base de datos PostgreSQL + aplicación móvil en</w:t>
-      </w:r>
-    </w:p>
-    <w:p>
-      <w:pPr>
-        <w:rPr/>
-      </w:pPr>
-      <w:r>
-        <w:rPr>
-          <w:rtl w:val="0"/>
-        </w:rPr>
-        <w:t xml:space="preserve">Flutter con las vistas de los tres roles), tal como lo exige el perfil de egreso y lo refleja el</w:t>
-      </w:r>
-    </w:p>
-    <w:p>
-      <w:pPr>
-        <w:rPr/>
-      </w:pPr>
-      <w:r>
-        <w:rPr>
-          <w:rtl w:val="0"/>
-        </w:rPr>
-        <w:t xml:space="preserve">cronograma en cascada de la Fase 1 (etapas de backend en S7–S11 y de frontend móvil en S12–S14).</w:t>
-      </w:r>
-    </w:p>
-    <w:p>
-      <w:pPr>
-        <w:rPr/>
-      </w:pPr>
-      <w:r>
-        <w:rPr>
-          <w:rtl w:val="0"/>
-        </w:rPr>
-        <w:t xml:space="preserve">Este alcance full stack es el que se entrega y evalúa en el marco académico de DUOC UC.</w:t>
-      </w:r>
-    </w:p>
-    <w:p>
-      <w:pPr>
-        <w:rPr/>
-      </w:pPr>
-      <w:r>
-        <w:rPr>
-          <w:rtl w:val="0"/>
-        </w:rPr>
-        <w:t xml:space="preserve">En paralelo, el equipo colabora con la empresa </w:t>
-      </w:r>
-      <w:r>
-        <w:rPr>
-          <w:b w:val="1"/>
-          <w:bCs w:val="1"/>
-          <w:rtl w:val="0"/>
-        </w:rPr>
-        <w:t xml:space="preserve">Alloxentric</w:t>
-      </w:r>
-      <w:r>
-        <w:rPr>
-          <w:rtl w:val="0"/>
-        </w:rPr>
-        <w:t xml:space="preserve"> —de la cual proviene la</w:t>
-      </w:r>
-    </w:p>
-    <w:p>
-      <w:pPr>
-        <w:rPr/>
-      </w:pPr>
-      <w:r>
-        <w:rPr>
-          <w:rtl w:val="0"/>
-        </w:rPr>
-        <w:t xml:space="preserve">especificación funcional del producto—, aportando principalmente el desarrollo del **backend y</w:t>
-      </w:r>
-    </w:p>
-    <w:p>
-      <w:pPr>
-        <w:rPr/>
-      </w:pPr>
-      <w:r>
-        <w:rPr>
-          <w:rtl w:val="0"/>
-        </w:rPr>
-        <w:t xml:space="preserve">la base de datos** que dan servicio a todos los roles. Esta relación con una contraparte real es</w:t>
-      </w:r>
-    </w:p>
-    <w:p>
-      <w:pPr>
-        <w:rPr/>
-      </w:pPr>
-      <w:r>
-        <w:rPr>
-          <w:rtl w:val="0"/>
-        </w:rPr>
-        <w:t xml:space="preserve">la que justifica dos decisiones de Fase 1: el uso de una </w:t>
-      </w:r>
-      <w:r>
-        <w:rPr>
-          <w:b w:val="1"/>
-          <w:bCs w:val="1"/>
-          <w:rtl w:val="0"/>
-        </w:rPr>
-        <w:t xml:space="preserve">metodología en cascada</w:t>
-      </w:r>
-      <w:r>
-        <w:rPr>
-          <w:rtl w:val="0"/>
-        </w:rPr>
-        <w:t xml:space="preserve"> (los</w:t>
-      </w:r>
-    </w:p>
-    <w:p>
-      <w:pPr>
-        <w:rPr/>
-      </w:pPr>
-      <w:r>
-        <w:rPr>
-          <w:rtl w:val="0"/>
-        </w:rPr>
-        <w:t xml:space="preserve">requisitos llegan estables y documentados desde la empresa) y el </w:t>
-      </w:r>
-      <w:r>
-        <w:rPr>
-          <w:b w:val="1"/>
-          <w:bCs w:val="1"/>
-          <w:rtl w:val="0"/>
-        </w:rPr>
-        <w:t xml:space="preserve">cronograma secuencial</w:t>
-      </w:r>
-      <w:r>
-        <w:rPr>
-          <w:rtl w:val="0"/>
-        </w:rPr>
-        <w:t xml:space="preserve"> que</w:t>
-      </w:r>
-    </w:p>
-    <w:p>
-      <w:pPr>
-        <w:rPr/>
-      </w:pPr>
-      <w:r>
-        <w:rPr>
-          <w:rtl w:val="0"/>
-        </w:rPr>
-        <w:t xml:space="preserve">primero asienta el núcleo de datos y backend, y luego construye la capa de presentación.</w:t>
-      </w:r>
-    </w:p>
-    <w:p>
-      <w:pPr>
-        <w:rPr/>
-      </w:pPr>
-      <w:r>
-        <w:rPr>
-          <w:rtl w:val="0"/>
-        </w:rPr>
-        <w:t xml:space="preserve">El avance de esta fecha se concentra, por tanto, en las capas de </w:t>
-      </w:r>
-      <w:r>
-        <w:rPr>
-          <w:b w:val="1"/>
-          <w:bCs w:val="1"/>
-          <w:rtl w:val="0"/>
-        </w:rPr>
         <w:t xml:space="preserve">datos y backend</w:t>
       </w:r>
       <w:r>
@@ -1340,16 +1200,7 @@
           <w:rtl w:val="0"/>
         </w:rPr>
         <w:t xml:space="preserve"> —la base</w:t>
-      </w:r>
-    </w:p>
-    <w:p>
-      <w:pPr>
-        <w:rPr/>
-      </w:pPr>
-      <w:r>
-        <w:rPr>
-          <w:rtl w:val="0"/>
-        </w:rPr>
+        <w:br w:type="textWrapping"/>
         <w:t xml:space="preserve">sobre la que se levantará el frontend en las etapas siguientes del cronograma—, sin que ello</w:t>
       </w:r>
     </w:p>
@@ -1393,7 +1244,7 @@
           <w:between w:space="0" w:sz="0" w:val="nil"/>
         </w:pBdr>
         <w:shd w:fill="auto" w:val="clear"/>
-        <w:spacing w:after="200" w:before="0" w:line="276" w:lineRule="auto"/>
+        <w:spacing w:after="200" w:before="0" w:line="360" w:lineRule="auto"/>
         <w:ind w:left="360" w:right="0" w:hanging="360"/>
         <w:jc w:val="left"/>
         <w:rPr/>
@@ -1477,7 +1328,7 @@
           <w:between w:space="0" w:sz="0" w:val="nil"/>
         </w:pBdr>
         <w:shd w:fill="auto" w:val="clear"/>
-        <w:spacing w:after="200" w:before="0" w:line="276" w:lineRule="auto"/>
+        <w:spacing w:after="200" w:before="0" w:line="360" w:lineRule="auto"/>
         <w:ind w:left="360" w:right="0" w:hanging="360"/>
         <w:jc w:val="left"/>
         <w:rPr/>
@@ -1520,38 +1371,11 @@
         </w:rPr>
         <w:t xml:space="preserve"> se diseñó e implementó en PostgreSQL un modelo</w:t>
       </w:r>
-    </w:p>
-    <w:p>
-      <w:pPr>
-        <w:rPr/>
-      </w:pPr>
-      <w:r>
-        <w:rPr>
-          <w:rtl w:val="0"/>
-        </w:rPr>
-        <w:t xml:space="preserve">relacional normalizado hasta la Segunda Forma Normal (2FN), compuesto por 24 tablas, con</w:t>
-      </w:r>
-    </w:p>
-    <w:p>
-      <w:pPr>
-        <w:rPr/>
-      </w:pPr>
-      <w:r>
-        <w:rPr>
-          <w:rtl w:val="0"/>
-        </w:rPr>
-        <w:t xml:space="preserve">integridad referencial completa, restricciones de dominio (CHECK), índices, triggers y</w:t>
-      </w:r>
-    </w:p>
-    <w:p>
-      <w:pPr>
-        <w:rPr/>
-      </w:pPr>
-      <w:r>
-        <w:rPr>
-          <w:rtl w:val="0"/>
-        </w:rPr>
-        <w:t xml:space="preserve">particionamiento por tiempo para la telemetría de signos vitales.</w:t>
+      <w:r>
+        <w:rPr>
+          <w:rtl w:val="0"/>
+        </w:rPr>
+        <w:t xml:space="preserve"> relacional normalizado hasta la Segunda Forma Normal (2FN), compuesto por 24 tablas, con integridad referencial completa, restricciones de dominio (CHECK), índices, triggers y particionamiento por tiempo para la telemetría de signos vitales.</w:t>
       </w:r>
     </w:p>
     <w:p>
@@ -1572,7 +1396,7 @@
           <w:between w:space="0" w:sz="0" w:val="nil"/>
         </w:pBdr>
         <w:shd w:fill="auto" w:val="clear"/>
-        <w:spacing w:after="200" w:before="0" w:line="276" w:lineRule="auto"/>
+        <w:spacing w:after="200" w:before="0" w:line="360" w:lineRule="auto"/>
         <w:ind w:left="360" w:right="0" w:hanging="360"/>
         <w:jc w:val="left"/>
         <w:rPr/>
@@ -1615,27 +1439,11 @@
         </w:rPr>
         <w:t xml:space="preserve"> se desarrolló la API REST en FastAPI con</w:t>
       </w:r>
-    </w:p>
-    <w:p>
-      <w:pPr>
-        <w:rPr/>
-      </w:pPr>
-      <w:r>
-        <w:rPr>
-          <w:rtl w:val="0"/>
-        </w:rPr>
-        <w:t xml:space="preserve">los módulos de autenticación, pacientes y círculo de cuidado, signos vitales y semáforo,</w:t>
-      </w:r>
-    </w:p>
-    <w:p>
-      <w:pPr>
-        <w:rPr/>
-      </w:pPr>
-      <w:r>
-        <w:rPr>
-          <w:rtl w:val="0"/>
-        </w:rPr>
-        <w:t xml:space="preserve">medicamentos y adherencia, y alertas/emergencias.</w:t>
+      <w:r>
+        <w:rPr>
+          <w:rtl w:val="0"/>
+        </w:rPr>
+        <w:t xml:space="preserve"> los módulos de autenticación, pacientes y círculo de cuidado, signos vitales y semáforo, medicamentos y adherencia, y alertas/emergencias.</w:t>
       </w:r>
     </w:p>
     <w:p>
@@ -1656,7 +1464,7 @@
           <w:between w:space="0" w:sz="0" w:val="nil"/>
         </w:pBdr>
         <w:shd w:fill="auto" w:val="clear"/>
-        <w:spacing w:after="200" w:before="0" w:line="276" w:lineRule="auto"/>
+        <w:spacing w:after="200" w:before="0" w:line="360" w:lineRule="auto"/>
         <w:ind w:left="360" w:right="0" w:hanging="360"/>
         <w:jc w:val="left"/>
         <w:rPr/>
@@ -1699,16 +1507,11 @@
         </w:rPr>
         <w:t xml:space="preserve"> la API se encuentra publicada y accesible mediante un</w:t>
       </w:r>
-    </w:p>
-    <w:p>
-      <w:pPr>
-        <w:rPr/>
-      </w:pPr>
-      <w:r>
-        <w:rPr>
-          <w:rtl w:val="0"/>
-        </w:rPr>
-        <w:t xml:space="preserve">dominio propio con túnel Cloudflare y documentación interactiva (OpenAPI/Swagger).</w:t>
+      <w:r>
+        <w:rPr>
+          <w:rtl w:val="0"/>
+        </w:rPr>
+        <w:t xml:space="preserve"> dominio propio con túnel Cloudflare y documentación interactiva (OpenAPI/Swagger).</w:t>
       </w:r>
     </w:p>
     <w:p>
@@ -1729,7 +1532,7 @@
           <w:between w:space="0" w:sz="0" w:val="nil"/>
         </w:pBdr>
         <w:shd w:fill="auto" w:val="clear"/>
-        <w:spacing w:after="200" w:before="0" w:line="276" w:lineRule="auto"/>
+        <w:spacing w:after="200" w:before="0" w:line="360" w:lineRule="auto"/>
         <w:ind w:left="360" w:right="0" w:hanging="360"/>
         <w:jc w:val="left"/>
         <w:rPr/>
@@ -1772,38 +1575,115 @@
         </w:rPr>
         <w:t xml:space="preserve"> se realizó una revisión de ingeniería</w:t>
       </w:r>
+      <w:r>
+        <w:rPr>
+          <w:rtl w:val="0"/>
+        </w:rPr>
+        <w:t xml:space="preserve"> que anticipa escenarios del mundo real (fallo del wearable, registro tardío de dosis, trazabilidad de responsabilidad), incorporando tablas de auditoría, parámetros de sistema, historización del bienestar y soporte del modelo freemium.</w:t>
+      </w:r>
     </w:p>
     <w:p>
       <w:pPr>
-        <w:rPr/>
-      </w:pPr>
-      <w:r>
-        <w:rPr>
-          <w:rtl w:val="0"/>
-        </w:rPr>
-        <w:t xml:space="preserve">que anticipa escenarios del mundo real (fallo del wearable, registro tardío de dosis,</w:t>
+        <w:rPr>
+          <w:b w:val="1"/>
+          <w:bCs w:val="1"/>
+        </w:rPr>
+      </w:pPr>
+      <w:r>
+        <w:rPr>
+          <w:rtl w:val="0"/>
+        </w:rPr>
       </w:r>
     </w:p>
     <w:p>
       <w:pPr>
-        <w:rPr/>
-      </w:pPr>
-      <w:r>
-        <w:rPr>
-          <w:rtl w:val="0"/>
-        </w:rPr>
-        <w:t xml:space="preserve">trazabilidad de responsabilidad), incorporando tablas de auditoría, parámetros de sistema,</w:t>
+        <w:rPr>
+          <w:b w:val="1"/>
+          <w:bCs w:val="1"/>
+        </w:rPr>
+      </w:pPr>
+      <w:r>
+        <w:rPr>
+          <w:rtl w:val="0"/>
+        </w:rPr>
       </w:r>
     </w:p>
     <w:p>
       <w:pPr>
-        <w:rPr/>
-      </w:pPr>
-      <w:r>
-        <w:rPr>
-          <w:rtl w:val="0"/>
-        </w:rPr>
-        <w:t xml:space="preserve">historización del bienestar y soporte del modelo freemium.</w:t>
+        <w:rPr>
+          <w:b w:val="1"/>
+          <w:bCs w:val="1"/>
+        </w:rPr>
+      </w:pPr>
+      <w:r>
+        <w:rPr>
+          <w:rtl w:val="0"/>
+        </w:rPr>
+      </w:r>
+    </w:p>
+    <w:p>
+      <w:pPr>
+        <w:rPr>
+          <w:b w:val="1"/>
+          <w:bCs w:val="1"/>
+        </w:rPr>
+      </w:pPr>
+      <w:r>
+        <w:rPr>
+          <w:rtl w:val="0"/>
+        </w:rPr>
+      </w:r>
+    </w:p>
+    <w:p>
+      <w:pPr>
+        <w:rPr>
+          <w:b w:val="1"/>
+          <w:bCs w:val="1"/>
+        </w:rPr>
+      </w:pPr>
+      <w:r>
+        <w:rPr>
+          <w:rtl w:val="0"/>
+        </w:rPr>
+      </w:r>
+    </w:p>
+    <w:p>
+      <w:pPr>
+        <w:rPr>
+          <w:b w:val="1"/>
+          <w:bCs w:val="1"/>
+        </w:rPr>
+      </w:pPr>
+      <w:r>
+        <w:rPr>
+          <w:rtl w:val="0"/>
+        </w:rPr>
+      </w:r>
+    </w:p>
+    <w:p>
+      <w:pPr>
+        <w:rPr>
+          <w:b w:val="1"/>
+          <w:bCs w:val="1"/>
+        </w:rPr>
+      </w:pPr>
+      <w:r>
+        <w:rPr>
+          <w:rtl w:val="0"/>
+        </w:rPr>
+      </w:r>
+    </w:p>
+    <w:p>
+      <w:pPr>
+        <w:rPr>
+          <w:b w:val="1"/>
+          <w:bCs w:val="1"/>
+        </w:rPr>
+      </w:pPr>
+      <w:r>
+        <w:rPr>
+          <w:rtl w:val="0"/>
+        </w:rPr>
       </w:r>
     </w:p>
     <w:p>
@@ -2375,18 +2255,54 @@
         <w:rPr>
           <w:rtl w:val="0"/>
         </w:rPr>
-        <w:t xml:space="preserve">No se realizaron ajustes a los objetivos definidos en la Fase 1. Los objetivos general y</w:t>
+        <w:t xml:space="preserve">No se realizaron ajustes a los objetivos definidos en la Fase 1. Los objetivos general y específicos se mantienen íntegros, ya que el alcance provino de una especificación estable entregada por la contraparte. </w:t>
+        <w:br w:type="textWrapping"/>
+      </w:r>
+      <w:r>
+        <w:rPr>
+          <w:b w:val="1"/>
+          <w:bCs w:val="1"/>
+          <w:rtl w:val="0"/>
+        </w:rPr>
+        <w:t xml:space="preserve">Se conserva la decisión de Fase 1</w:t>
+      </w:r>
+      <w:r>
+        <w:rPr>
+          <w:rtl w:val="0"/>
+        </w:rPr>
+        <w:t xml:space="preserve"> de documentar las métricas cuantitativas de los objetivos (reducción de tiempos de respuesta, adherencia, adopción, conversión y disponibilidad) con </w:t>
+        <w:br w:type="textWrapping"/>
+      </w:r>
+      <w:r>
+        <w:rPr>
+          <w:b w:val="1"/>
+          <w:bCs w:val="1"/>
+          <w:rtl w:val="0"/>
+        </w:rPr>
+        <w:t xml:space="preserve">orientación de análisis de negocio</w:t>
+      </w:r>
+      <w:r>
+        <w:rPr>
+          <w:rtl w:val="0"/>
+        </w:rPr>
+        <w:t xml:space="preserve">: representan la proyección del producto en operación real a futuro, no métricas medibles dentro del alcance académico del proyecto de título.</w:t>
       </w:r>
     </w:p>
     <w:p>
       <w:pPr>
+        <w:pStyle w:val="Heading3"/>
         <w:rPr/>
       </w:pPr>
       <w:r>
         <w:rPr>
           <w:rtl w:val="0"/>
         </w:rPr>
-        <w:t xml:space="preserve">específicos se mantienen íntegros, ya que el alcance provino de una especificación estable</w:t>
+        <w:br w:type="textWrapping"/>
+        <w:br w:type="textWrapping"/>
+        <w:br w:type="textWrapping"/>
+        <w:br w:type="textWrapping"/>
+        <w:br w:type="textWrapping"/>
+        <w:t xml:space="preserve">Metodología (ajuste)</w:t>
       </w:r>
     </w:p>
     <w:p>
@@ -2397,7 +2313,7 @@
         <w:rPr>
           <w:rtl w:val="0"/>
         </w:rPr>
-        <w:t xml:space="preserve">entregada por la contraparte. </w:t>
+        <w:t xml:space="preserve">No se realizaron ajustes a la metodología. Se mantiene el </w:t>
       </w:r>
       <w:r>
         <w:rPr>
@@ -2405,162 +2321,13 @@
           <w:bCs w:val="1"/>
           <w:rtl w:val="0"/>
         </w:rPr>
-        <w:t xml:space="preserve">Se conserva la decisión de Fase 1</w:t>
-      </w:r>
-      <w:r>
-        <w:rPr>
-          <w:rtl w:val="0"/>
-        </w:rPr>
-        <w:t xml:space="preserve"> de documentar las métricas</w:t>
-      </w:r>
-    </w:p>
-    <w:p>
-      <w:pPr>
-        <w:rPr/>
-      </w:pPr>
-      <w:r>
-        <w:rPr>
-          <w:rtl w:val="0"/>
-        </w:rPr>
-        <w:t xml:space="preserve">cuantitativas de los objetivos (reducción de tiempos de respuesta, adherencia, adopción,</w:t>
-      </w:r>
-    </w:p>
-    <w:p>
-      <w:pPr>
-        <w:rPr/>
-      </w:pPr>
-      <w:r>
-        <w:rPr>
-          <w:rtl w:val="0"/>
-        </w:rPr>
-        <w:t xml:space="preserve">conversión y disponibilidad) con </w:t>
-      </w:r>
-      <w:r>
-        <w:rPr>
-          <w:b w:val="1"/>
-          <w:bCs w:val="1"/>
-          <w:rtl w:val="0"/>
-        </w:rPr>
-        <w:t xml:space="preserve">orientación de análisis de negocio</w:t>
-      </w:r>
-      <w:r>
-        <w:rPr>
-          <w:rtl w:val="0"/>
-        </w:rPr>
-        <w:t xml:space="preserve">: representan la</w:t>
-      </w:r>
-    </w:p>
-    <w:p>
-      <w:pPr>
-        <w:rPr/>
-      </w:pPr>
-      <w:r>
-        <w:rPr>
-          <w:rtl w:val="0"/>
-        </w:rPr>
-        <w:t xml:space="preserve">proyección del producto en operación real a futuro, no métricas medibles dentro del alcance</w:t>
-      </w:r>
-    </w:p>
-    <w:p>
-      <w:pPr>
-        <w:rPr/>
-      </w:pPr>
-      <w:r>
-        <w:rPr>
-          <w:rtl w:val="0"/>
-        </w:rPr>
-        <w:t xml:space="preserve">académico del proyecto de título.</w:t>
-      </w:r>
-    </w:p>
-    <w:p>
-      <w:pPr>
-        <w:pStyle w:val="Heading3"/>
-        <w:rPr/>
-      </w:pPr>
-      <w:r>
-        <w:rPr>
-          <w:rtl w:val="0"/>
-        </w:rPr>
-        <w:t xml:space="preserve">Metodología (ajuste)</w:t>
-      </w:r>
-    </w:p>
-    <w:p>
-      <w:pPr>
-        <w:rPr/>
-      </w:pPr>
-      <w:r>
-        <w:rPr>
-          <w:rtl w:val="0"/>
-        </w:rPr>
-        <w:t xml:space="preserve">No se realizaron ajustes a la metodología. Se mantiene el </w:t>
-      </w:r>
-      <w:r>
-        <w:rPr>
-          <w:b w:val="1"/>
-          <w:bCs w:val="1"/>
-          <w:rtl w:val="0"/>
-        </w:rPr>
         <w:t xml:space="preserve">Enfoque Tradicional (Cascada)</w:t>
       </w:r>
       <w:r>
         <w:rPr>
           <w:rtl w:val="0"/>
         </w:rPr>
-      </w:r>
-    </w:p>
-    <w:p>
-      <w:pPr>
-        <w:rPr/>
-      </w:pPr>
-      <w:r>
-        <w:rPr>
-          <w:rtl w:val="0"/>
-        </w:rPr>
-        <w:t xml:space="preserve">definido en Fase 1, con sus cinco etapas secuenciales (Análisis → Diseño → Implementación →</w:t>
-      </w:r>
-    </w:p>
-    <w:p>
-      <w:pPr>
-        <w:rPr/>
-      </w:pPr>
-      <w:r>
-        <w:rPr>
-          <w:rtl w:val="0"/>
-        </w:rPr>
-        <w:t xml:space="preserve">Pruebas → Despliegue). La naturaleza del proyecto —requisitos estables y documentación rigurosa</w:t>
-      </w:r>
-    </w:p>
-    <w:p>
-      <w:pPr>
-        <w:rPr/>
-      </w:pPr>
-      <w:r>
-        <w:rPr>
-          <w:rtl w:val="0"/>
-        </w:rPr>
-        <w:t xml:space="preserve">exigida académicamente— sigue justificando este enfoque. Internamente, y de forma transparente,</w:t>
-      </w:r>
-    </w:p>
-    <w:p>
-      <w:pPr>
-        <w:rPr/>
-      </w:pPr>
-      <w:r>
-        <w:rPr>
-          <w:rtl w:val="0"/>
-        </w:rPr>
-        <w:t xml:space="preserve">el equipo coordina sus entregas con la empresa en ciclos cortos; sin embargo, el marco formal de</w:t>
-      </w:r>
-    </w:p>
-    <w:p>
-      <w:pPr>
-        <w:rPr/>
-      </w:pPr>
-      <w:r>
-        <w:rPr>
-          <w:rtl w:val="0"/>
-        </w:rPr>
-        <w:t xml:space="preserve">titulación y de este informe es Cascada, y así se reporta el avance.</w:t>
+        <w:t xml:space="preserve"> definido en Fase 1, con sus cinco etapas secuenciales (Análisis → Diseño → Implementación → Pruebas → Despliegue). La naturaleza del proyecto —requisitos estables y documentación rigurosa exigida académicamente— sigue justificando este enfoque. Internamente, y de forma transparente, el equipo coordina sus entregas con la empresa en ciclos cortos; sin embargo, el marco formal de titulación y de este informe es Cascada, y así se reporta el avance.</w:t>
       </w:r>
     </w:p>
     <w:p>
@@ -2577,7 +2344,7 @@
           <w:between w:space="0" w:sz="0" w:val="nil"/>
         </w:pBdr>
         <w:shd w:fill="auto" w:val="clear"/>
-        <w:spacing w:after="280" w:before="200" w:line="276" w:lineRule="auto"/>
+        <w:spacing w:after="280" w:before="200" w:line="360" w:lineRule="auto"/>
         <w:ind w:left="936" w:right="936" w:firstLine="0"/>
         <w:jc w:val="left"/>
         <w:rPr>
@@ -2630,7 +2397,7 @@
           <w:between w:space="0" w:sz="0" w:val="nil"/>
         </w:pBdr>
         <w:shd w:fill="auto" w:val="clear"/>
-        <w:spacing w:after="280" w:before="200" w:line="276" w:lineRule="auto"/>
+        <w:spacing w:after="280" w:before="200" w:line="360" w:lineRule="auto"/>
         <w:ind w:left="936" w:right="936" w:firstLine="0"/>
         <w:jc w:val="left"/>
         <w:rPr>
@@ -2683,7 +2450,7 @@
           <w:between w:space="0" w:sz="0" w:val="nil"/>
         </w:pBdr>
         <w:shd w:fill="auto" w:val="clear"/>
-        <w:spacing w:after="280" w:before="200" w:line="276" w:lineRule="auto"/>
+        <w:spacing w:after="280" w:before="200" w:line="360" w:lineRule="auto"/>
         <w:ind w:left="936" w:right="936" w:firstLine="0"/>
         <w:jc w:val="left"/>
         <w:rPr>
@@ -2721,24 +2488,18 @@
         </w:rPr>
         <w:t xml:space="preserve">el modelo es íntegramente relacional en PostgreSQL, normalizado hasta 2FN. Los pocos</w:t>
       </w:r>
-    </w:p>
-    <w:p>
-      <w:pPr>
-        <w:keepNext w:val="0"/>
-        <w:keepLines w:val="0"/>
-        <w:pageBreakBefore w:val="0"/>
-        <w:widowControl w:val="1"/>
-        <w:pBdr>
-          <w:top w:space="0" w:sz="0" w:val="nil"/>
-          <w:left w:space="0" w:sz="0" w:val="nil"/>
-          <w:bottom w:color="4f81bd" w:space="4" w:sz="4" w:val="single"/>
-          <w:right w:space="0" w:sz="0" w:val="nil"/>
-          <w:between w:space="0" w:sz="0" w:val="nil"/>
-        </w:pBdr>
-        <w:shd w:fill="auto" w:val="clear"/>
-        <w:spacing w:after="280" w:before="200" w:line="276" w:lineRule="auto"/>
-        <w:ind w:left="936" w:right="936" w:firstLine="0"/>
-        <w:jc w:val="left"/>
+      <w:r>
+        <w:rPr>
+          <w:b w:val="1"/>
+          <w:bCs w:val="1"/>
+          <w:i w:val="1"/>
+          <w:iCs w:val="1"/>
+          <w:color w:val="4f81bd"/>
+          <w:rtl w:val="0"/>
+        </w:rPr>
+        <w:t xml:space="preserve"> </w:t>
+      </w:r>
+      <w:r>
         <w:rPr>
           <w:rFonts w:ascii="Calibri" w:cs="Calibri" w:eastAsia="Calibri" w:hAnsi="Calibri"/>
           <w:b w:val="1"/>
@@ -2753,8 +2514,29 @@
           <w:u w:val="none"/>
           <w:shd w:fill="auto" w:val="clear"/>
           <w:vertAlign w:val="baseline"/>
-        </w:rPr>
-      </w:pPr>
+          <w:rtl w:val="0"/>
+        </w:rPr>
+        <w:t xml:space="preserve">campos </w:t>
+      </w:r>
+      <w:r>
+        <w:rPr>
+          <w:rFonts w:ascii="Consolas" w:cs="Consolas" w:eastAsia="Consolas" w:hAnsi="Consolas"/>
+          <w:b w:val="1"/>
+          <w:bCs w:val="1"/>
+          <w:i w:val="1"/>
+          <w:iCs w:val="1"/>
+          <w:smallCaps w:val="0"/>
+          <w:strike w:val="0"/>
+          <w:color w:val="c7254e"/>
+          <w:sz w:val="18"/>
+          <w:szCs w:val="18"/>
+          <w:u w:val="none"/>
+          <w:shd w:fill="auto" w:val="clear"/>
+          <w:vertAlign w:val="baseline"/>
+          <w:rtl w:val="0"/>
+        </w:rPr>
+        <w:t xml:space="preserve">jsonb</w:t>
+      </w:r>
       <w:r>
         <w:rPr>
           <w:rFonts w:ascii="Calibri" w:cs="Calibri" w:eastAsia="Calibri" w:hAnsi="Calibri"/>
@@ -2772,26 +2554,18 @@
           <w:vertAlign w:val="baseline"/>
           <w:rtl w:val="0"/>
         </w:rPr>
-        <w:t xml:space="preserve">campos </w:t>
-      </w:r>
-      <w:r>
-        <w:rPr>
-          <w:rFonts w:ascii="Consolas" w:cs="Consolas" w:eastAsia="Consolas" w:hAnsi="Consolas"/>
+        <w:t xml:space="preserve"> presentes corresponden a atributos de estructura variable y están documentados</w:t>
+      </w:r>
+      <w:r>
+        <w:rPr>
           <w:b w:val="1"/>
           <w:bCs w:val="1"/>
           <w:i w:val="1"/>
           <w:iCs w:val="1"/>
-          <w:smallCaps w:val="0"/>
-          <w:strike w:val="0"/>
-          <w:color w:val="c7254e"/>
-          <w:sz w:val="18"/>
-          <w:szCs w:val="18"/>
-          <w:u w:val="none"/>
-          <w:shd w:fill="auto" w:val="clear"/>
-          <w:vertAlign w:val="baseline"/>
-          <w:rtl w:val="0"/>
-        </w:rPr>
-        <w:t xml:space="preserve">jsonb</w:t>
+          <w:color w:val="4f81bd"/>
+          <w:rtl w:val="0"/>
+        </w:rPr>
+        <w:t xml:space="preserve"> </w:t>
       </w:r>
       <w:r>
         <w:rPr>
@@ -2810,59 +2584,6 @@
           <w:vertAlign w:val="baseline"/>
           <w:rtl w:val="0"/>
         </w:rPr>
-        <w:t xml:space="preserve"> presentes corresponden a atributos de estructura variable y están documentados</w:t>
-      </w:r>
-    </w:p>
-    <w:p>
-      <w:pPr>
-        <w:keepNext w:val="0"/>
-        <w:keepLines w:val="0"/>
-        <w:pageBreakBefore w:val="0"/>
-        <w:widowControl w:val="1"/>
-        <w:pBdr>
-          <w:top w:space="0" w:sz="0" w:val="nil"/>
-          <w:left w:space="0" w:sz="0" w:val="nil"/>
-          <w:bottom w:color="4f81bd" w:space="4" w:sz="4" w:val="single"/>
-          <w:right w:space="0" w:sz="0" w:val="nil"/>
-          <w:between w:space="0" w:sz="0" w:val="nil"/>
-        </w:pBdr>
-        <w:shd w:fill="auto" w:val="clear"/>
-        <w:spacing w:after="280" w:before="200" w:line="276" w:lineRule="auto"/>
-        <w:ind w:left="936" w:right="936" w:firstLine="0"/>
-        <w:jc w:val="left"/>
-        <w:rPr>
-          <w:rFonts w:ascii="Calibri" w:cs="Calibri" w:eastAsia="Calibri" w:hAnsi="Calibri"/>
-          <w:b w:val="1"/>
-          <w:bCs w:val="1"/>
-          <w:i w:val="1"/>
-          <w:iCs w:val="1"/>
-          <w:smallCaps w:val="0"/>
-          <w:strike w:val="0"/>
-          <w:color w:val="4f81bd"/>
-          <w:sz w:val="22"/>
-          <w:szCs w:val="22"/>
-          <w:u w:val="none"/>
-          <w:shd w:fill="auto" w:val="clear"/>
-          <w:vertAlign w:val="baseline"/>
-        </w:rPr>
-      </w:pPr>
-      <w:r>
-        <w:rPr>
-          <w:rFonts w:ascii="Calibri" w:cs="Calibri" w:eastAsia="Calibri" w:hAnsi="Calibri"/>
-          <w:b w:val="1"/>
-          <w:bCs w:val="1"/>
-          <w:i w:val="1"/>
-          <w:iCs w:val="1"/>
-          <w:smallCaps w:val="0"/>
-          <w:strike w:val="0"/>
-          <w:color w:val="4f81bd"/>
-          <w:sz w:val="22"/>
-          <w:szCs w:val="22"/>
-          <w:u w:val="none"/>
-          <w:shd w:fill="auto" w:val="clear"/>
-          <w:vertAlign w:val="baseline"/>
-          <w:rtl w:val="0"/>
-        </w:rPr>
         <w:t xml:space="preserve">como excepción justificada. Esta corrección se detalla en el apartado 3.</w:t>
       </w:r>
     </w:p>
@@ -2888,6 +2609,10 @@
         <w:rPr>
           <w:rtl w:val="0"/>
         </w:rPr>
+        <w:br w:type="textWrapping"/>
+        <w:br w:type="textWrapping"/>
+        <w:br w:type="textWrapping"/>
+        <w:br w:type="textWrapping"/>
         <w:t xml:space="preserve">Evidencias de avance</w:t>
       </w:r>
     </w:p>
@@ -3296,7 +3021,7 @@
                 <w:szCs w:val="18"/>
                 <w:rtl w:val="0"/>
               </w:rPr>
-              <w:t xml:space="preserve">sql/000_schema_completo.sql</w:t>
+              <w:t xml:space="preserve">sql/schema/000_schema_completo.sql</w:t>
             </w:r>
             <w:r>
               <w:rPr>
@@ -3840,7 +3565,49 @@
         <w:rPr>
           <w:rtl w:val="0"/>
         </w:rPr>
-        <w:t xml:space="preserve"> Las evidencias cubren las tres</w:t>
+        <w:t xml:space="preserve"> Las evidencias cubren las tres dimensiones que exige la asignatura: </w:t>
+      </w:r>
+      <w:r>
+        <w:rPr>
+          <w:b w:val="1"/>
+          <w:bCs w:val="1"/>
+          <w:rtl w:val="0"/>
+        </w:rPr>
+        <w:t xml:space="preserve">documentación</w:t>
+      </w:r>
+      <w:r>
+        <w:rPr>
+          <w:rtl w:val="0"/>
+        </w:rPr>
+        <w:t xml:space="preserve"> (E1, E2, E6, E7, E8), </w:t>
+      </w:r>
+      <w:r>
+        <w:rPr>
+          <w:b w:val="1"/>
+          <w:bCs w:val="1"/>
+          <w:rtl w:val="0"/>
+        </w:rPr>
+        <w:t xml:space="preserve">programación</w:t>
+      </w:r>
+      <w:r>
+        <w:rPr>
+          <w:rtl w:val="0"/>
+        </w:rPr>
+        <w:t xml:space="preserve"> (E3, E5) y </w:t>
+      </w:r>
+      <w:r>
+        <w:rPr>
+          <w:b w:val="1"/>
+          <w:bCs w:val="1"/>
+          <w:rtl w:val="0"/>
+        </w:rPr>
+        <w:t xml:space="preserve">almacenamiento de datos</w:t>
+      </w:r>
+      <w:r>
+        <w:rPr>
+          <w:rtl w:val="0"/>
+        </w:rPr>
+        <w:t xml:space="preserve"> (E2, E3, E4). El modelo de datos y su script ejecutable son el entregable central comprometido para esta fecha de avance, coherente con la etapa de</w:t>
       </w:r>
     </w:p>
     <w:p>
@@ -3851,7 +3618,8 @@
         <w:rPr>
           <w:rtl w:val="0"/>
         </w:rPr>
-        <w:t xml:space="preserve">dimensiones que exige la asignatura: </w:t>
+        <w:br w:type="textWrapping"/>
+        <w:t xml:space="preserve">Diseño del cronograma. </w:t>
       </w:r>
       <w:r>
         <w:rPr>
@@ -3859,103 +3627,13 @@
           <w:bCs w:val="1"/>
           <w:rtl w:val="0"/>
         </w:rPr>
-        <w:t xml:space="preserve">documentación</w:t>
-      </w:r>
-      <w:r>
-        <w:rPr>
-          <w:rtl w:val="0"/>
-        </w:rPr>
-        <w:t xml:space="preserve"> (E1, E2, E6, E7, E8), </w:t>
-      </w:r>
-      <w:r>
-        <w:rPr>
-          <w:b w:val="1"/>
-          <w:bCs w:val="1"/>
-          <w:rtl w:val="0"/>
-        </w:rPr>
-        <w:t xml:space="preserve">programación</w:t>
-      </w:r>
-      <w:r>
-        <w:rPr>
-          <w:rtl w:val="0"/>
-        </w:rPr>
-      </w:r>
-    </w:p>
-    <w:p>
-      <w:pPr>
-        <w:rPr/>
-      </w:pPr>
-      <w:r>
-        <w:rPr>
-          <w:rtl w:val="0"/>
-        </w:rPr>
-        <w:t xml:space="preserve">(E3, E5) y </w:t>
-      </w:r>
-      <w:r>
-        <w:rPr>
-          <w:b w:val="1"/>
-          <w:bCs w:val="1"/>
-          <w:rtl w:val="0"/>
-        </w:rPr>
-        <w:t xml:space="preserve">almacenamiento de datos</w:t>
-      </w:r>
-      <w:r>
-        <w:rPr>
-          <w:rtl w:val="0"/>
-        </w:rPr>
-        <w:t xml:space="preserve"> (E2, E3, E4). El modelo de datos y su script ejecutable</w:t>
-      </w:r>
-    </w:p>
-    <w:p>
-      <w:pPr>
-        <w:rPr/>
-      </w:pPr>
-      <w:r>
-        <w:rPr>
-          <w:rtl w:val="0"/>
-        </w:rPr>
-        <w:t xml:space="preserve">son el entregable central comprometido para esta fecha de avance, coherente con la etapa de</w:t>
-      </w:r>
-    </w:p>
-    <w:p>
-      <w:pPr>
-        <w:rPr/>
-      </w:pPr>
-      <w:r>
-        <w:rPr>
-          <w:rtl w:val="0"/>
-        </w:rPr>
-        <w:t xml:space="preserve">Diseño del cronograma.</w:t>
-      </w:r>
-    </w:p>
-    <w:p>
-      <w:pPr>
-        <w:rPr/>
-      </w:pPr>
-      <w:r>
-        <w:rPr>
-          <w:b w:val="1"/>
-          <w:bCs w:val="1"/>
-          <w:rtl w:val="0"/>
-        </w:rPr>
         <w:t xml:space="preserve">Resguardo de la calidad desde la disciplina.</w:t>
       </w:r>
       <w:r>
         <w:rPr>
           <w:rtl w:val="0"/>
         </w:rPr>
-        <w:t xml:space="preserve"> La calidad se aseguró con prácticas estándar de</w:t>
-      </w:r>
-    </w:p>
-    <w:p>
-      <w:pPr>
-        <w:rPr/>
-      </w:pPr>
-      <w:r>
-        <w:rPr>
-          <w:rtl w:val="0"/>
-        </w:rPr>
-        <w:t xml:space="preserve">la industria del desarrollo de software y de la ingeniería de datos:</w:t>
+        <w:t xml:space="preserve"> La calidad se aseguró con prácticas estándar de la industria del desarrollo de software y de la ingeniería de datos:</w:t>
       </w:r>
     </w:p>
     <w:p>
@@ -3976,7 +3654,7 @@
           <w:between w:space="0" w:sz="0" w:val="nil"/>
         </w:pBdr>
         <w:shd w:fill="auto" w:val="clear"/>
-        <w:spacing w:after="200" w:before="0" w:line="276" w:lineRule="auto"/>
+        <w:spacing w:after="200" w:before="0" w:line="360" w:lineRule="auto"/>
         <w:ind w:left="360" w:right="0" w:hanging="360"/>
         <w:jc w:val="left"/>
         <w:rPr/>
@@ -4019,16 +3697,11 @@
         </w:rPr>
         <w:t xml:space="preserve">, con un documento que audita cada decisión y justifica las</w:t>
       </w:r>
-    </w:p>
-    <w:p>
-      <w:pPr>
-        <w:rPr/>
-      </w:pPr>
-      <w:r>
-        <w:rPr>
-          <w:rtl w:val="0"/>
-        </w:rPr>
-        <w:t xml:space="preserve">excepciones técnicas (particionamiento, atributos variables).</w:t>
+      <w:r>
+        <w:rPr>
+          <w:rtl w:val="0"/>
+        </w:rPr>
+        <w:t xml:space="preserve"> excepciones técnicas (particionamiento, atributos variables).</w:t>
       </w:r>
     </w:p>
     <w:p>
@@ -4049,7 +3722,7 @@
           <w:between w:space="0" w:sz="0" w:val="nil"/>
         </w:pBdr>
         <w:shd w:fill="auto" w:val="clear"/>
-        <w:spacing w:after="200" w:before="0" w:line="276" w:lineRule="auto"/>
+        <w:spacing w:after="200" w:before="0" w:line="360" w:lineRule="auto"/>
         <w:ind w:left="360" w:right="0" w:hanging="360"/>
         <w:jc w:val="left"/>
         <w:rPr/>
@@ -4111,29 +3784,13 @@
           <w:szCs w:val="18"/>
           <w:rtl w:val="0"/>
         </w:rPr>
-        <w:t xml:space="preserve">ON DELETE CASCADE</w:t>
-      </w:r>
-      <w:r>
-        <w:rPr>
-          <w:rtl w:val="0"/>
-        </w:rPr>
-        <w:t xml:space="preserve"> / </w:t>
-      </w:r>
-      <w:r>
-        <w:rPr>
-          <w:rFonts w:ascii="Consolas" w:cs="Consolas" w:eastAsia="Consolas" w:hAnsi="Consolas"/>
-          <w:color w:val="c7254e"/>
-          <w:sz w:val="18"/>
-          <w:szCs w:val="18"/>
-          <w:rtl w:val="0"/>
-        </w:rPr>
-        <w:t xml:space="preserve">SET NULL</w:t>
-      </w:r>
-      <w:r>
-        <w:rPr>
-          <w:rtl w:val="0"/>
-        </w:rPr>
-        <w:t xml:space="preserve">) e </w:t>
+        <w:t xml:space="preserve">ON DELETE RESTRICT</w:t>
+      </w:r>
+      <w:r>
+        <w:rPr>
+          <w:rtl w:val="0"/>
+        </w:rPr>
+        <w:t xml:space="preserve">, sin borrado físico) e </w:t>
       </w:r>
       <w:r>
         <w:rPr>
@@ -4184,7 +3841,7 @@
           <w:between w:space="0" w:sz="0" w:val="nil"/>
         </w:pBdr>
         <w:shd w:fill="auto" w:val="clear"/>
-        <w:spacing w:after="200" w:before="0" w:line="276" w:lineRule="auto"/>
+        <w:spacing w:after="200" w:before="0" w:line="360" w:lineRule="auto"/>
         <w:ind w:left="360" w:right="0" w:hanging="360"/>
         <w:jc w:val="left"/>
         <w:rPr/>
@@ -4227,16 +3884,11 @@
         </w:rPr>
         <w:t xml:space="preserve"> con commits atómicos y descriptivos por módulo, lo que permite</w:t>
       </w:r>
-    </w:p>
-    <w:p>
-      <w:pPr>
-        <w:rPr/>
-      </w:pPr>
-      <w:r>
-        <w:rPr>
-          <w:rtl w:val="0"/>
-        </w:rPr>
-        <w:t xml:space="preserve">trazar la evolución y la autoría.</w:t>
+      <w:r>
+        <w:rPr>
+          <w:rtl w:val="0"/>
+        </w:rPr>
+        <w:t xml:space="preserve"> trazar la evolución y la autoría.</w:t>
       </w:r>
     </w:p>
     <w:p>
@@ -4257,7 +3909,7 @@
           <w:between w:space="0" w:sz="0" w:val="nil"/>
         </w:pBdr>
         <w:shd w:fill="auto" w:val="clear"/>
-        <w:spacing w:after="200" w:before="0" w:line="276" w:lineRule="auto"/>
+        <w:spacing w:after="200" w:before="0" w:line="360" w:lineRule="auto"/>
         <w:ind w:left="360" w:right="0" w:hanging="360"/>
         <w:jc w:val="left"/>
         <w:rPr/>
@@ -4336,18 +3988,13 @@
           <w:vertAlign w:val="baseline"/>
           <w:rtl w:val="0"/>
         </w:rPr>
-        <w:t xml:space="preserve">) y configuración por variables de</w:t>
-      </w:r>
-    </w:p>
-    <w:p>
-      <w:pPr>
-        <w:rPr/>
-      </w:pPr>
-      <w:r>
-        <w:rPr>
-          <w:rtl w:val="0"/>
-        </w:rPr>
-        <w:t xml:space="preserve">entorno, cumpliendo portabilidad y separación de secretos.</w:t>
+        <w:t xml:space="preserve">) y **configuración por variables de</w:t>
+      </w:r>
+      <w:r>
+        <w:rPr>
+          <w:rtl w:val="0"/>
+        </w:rPr>
+        <w:t xml:space="preserve"> entorno**, cumpliendo portabilidad y separación de secretos.</w:t>
       </w:r>
     </w:p>
     <w:p>
@@ -4368,7 +4015,7 @@
           <w:between w:space="0" w:sz="0" w:val="nil"/>
         </w:pBdr>
         <w:shd w:fill="auto" w:val="clear"/>
-        <w:spacing w:after="0" w:before="0" w:line="276" w:lineRule="auto"/>
+        <w:spacing w:after="0" w:before="0" w:line="360" w:lineRule="auto"/>
         <w:ind w:left="360" w:right="0" w:hanging="360"/>
         <w:jc w:val="left"/>
         <w:rPr/>
@@ -4409,7 +4056,32 @@
           <w:vertAlign w:val="baseline"/>
           <w:rtl w:val="0"/>
         </w:rPr>
-        <w:t xml:space="preserve"> desde el código (OpenAPI/Swagger), accesible en línea.</w:t>
+        <w:t xml:space="preserve"> desde el código (OpenAPI/Swagger), accesible</w:t>
+      </w:r>
+      <w:r>
+        <w:rPr>
+          <w:rtl w:val="0"/>
+        </w:rPr>
+        <w:t xml:space="preserve"> </w:t>
+      </w:r>
+      <w:r>
+        <w:rPr>
+          <w:rFonts w:ascii="Calibri" w:cs="Calibri" w:eastAsia="Calibri" w:hAnsi="Calibri"/>
+          <w:b w:val="0"/>
+          <w:bCs w:val="0"/>
+          <w:i w:val="0"/>
+          <w:iCs w:val="0"/>
+          <w:smallCaps w:val="0"/>
+          <w:strike w:val="0"/>
+          <w:color w:val="000000"/>
+          <w:sz w:val="22"/>
+          <w:szCs w:val="22"/>
+          <w:u w:val="none"/>
+          <w:shd w:fill="auto" w:val="clear"/>
+          <w:vertAlign w:val="baseline"/>
+          <w:rtl w:val="0"/>
+        </w:rPr>
+        <w:t xml:space="preserve">en línea.</w:t>
       </w:r>
     </w:p>
     <w:p>
@@ -4430,7 +4102,7 @@
           <w:between w:space="0" w:sz="0" w:val="nil"/>
         </w:pBdr>
         <w:shd w:fill="auto" w:val="clear"/>
-        <w:spacing w:after="200" w:before="0" w:line="276" w:lineRule="auto"/>
+        <w:spacing w:after="200" w:before="0" w:line="360" w:lineRule="auto"/>
         <w:ind w:left="360" w:right="0" w:hanging="360"/>
         <w:jc w:val="left"/>
         <w:rPr/>
@@ -4473,16 +4145,11 @@
         </w:rPr>
         <w:t xml:space="preserve"> contraseñas con hash, tokens hasheados, control de acceso por rol y</w:t>
       </w:r>
-    </w:p>
-    <w:p>
-      <w:pPr>
-        <w:rPr/>
-      </w:pPr>
-      <w:r>
-        <w:rPr>
-          <w:rtl w:val="0"/>
-        </w:rPr>
-        <w:t xml:space="preserve">trazabilidad clínica inmutable (</w:t>
+      <w:r>
+        <w:rPr>
+          <w:rtl w:val="0"/>
+        </w:rPr>
+        <w:t xml:space="preserve"> trazabilidad clínica inmutable (</w:t>
       </w:r>
       <w:r>
         <w:rPr>
@@ -4545,7 +4212,7 @@
         <w:rPr>
           <w:rtl w:val="0"/>
         </w:rPr>
-        <w:t xml:space="preserve">respetando sus etapas, duraciones y responsables. Estados posibles: En curso · Con retraso ·</w:t>
+        <w:t xml:space="preserve">respetando sus etapas, duraciones y responsables. Estados posibles: *En curso · Con retraso ·</w:t>
       </w:r>
     </w:p>
     <w:p>
@@ -4556,7 +4223,7 @@
         <w:rPr>
           <w:rtl w:val="0"/>
         </w:rPr>
-        <w:t xml:space="preserve">No iniciado · Completado · Ajustada.</w:t>
+        <w:t xml:space="preserve">No iniciado · Completado · Ajustada*.</w:t>
       </w:r>
     </w:p>
     <w:tbl>
@@ -4580,9 +4247,9 @@
         <w:gridCol w:w="1080"/>
         <w:gridCol w:w="1080"/>
         <w:gridCol w:w="1080"/>
-        <w:gridCol w:w="1200"/>
-        <w:gridCol w:w="1320"/>
-        <w:gridCol w:w="720"/>
+        <w:gridCol w:w="1080"/>
+        <w:gridCol w:w="1080"/>
+        <w:gridCol w:w="1080"/>
         <w:gridCol w:w="1080"/>
         <w:tblGridChange w:id="0">
           <w:tblGrid>
@@ -4590,9 +4257,9 @@
             <w:gridCol w:w="1080"/>
             <w:gridCol w:w="1080"/>
             <w:gridCol w:w="1080"/>
-            <w:gridCol w:w="1200"/>
-            <w:gridCol w:w="1320"/>
-            <w:gridCol w:w="720"/>
+            <w:gridCol w:w="1080"/>
+            <w:gridCol w:w="1080"/>
+            <w:gridCol w:w="1080"/>
             <w:gridCol w:w="1080"/>
           </w:tblGrid>
         </w:tblGridChange>
@@ -5682,18 +5349,7 @@
         <w:rPr>
           <w:rtl w:val="0"/>
         </w:rPr>
-        <w:t xml:space="preserve">; la</w:t>
-      </w:r>
-    </w:p>
-    <w:p>
-      <w:pPr>
-        <w:rPr/>
-      </w:pPr>
-      <w:r>
-        <w:rPr>
-          <w:rtl w:val="0"/>
-        </w:rPr>
-        <w:t xml:space="preserve">Implementación del backend (S7–S11) está </w:t>
+        <w:t xml:space="preserve">; la Implementación del backend (S7–S11) está </w:t>
       </w:r>
       <w:r>
         <w:rPr>
@@ -5707,18 +5363,7 @@
         <w:rPr>
           <w:rtl w:val="0"/>
         </w:rPr>
-        <w:t xml:space="preserve"> con el núcleo de salud operativo; el</w:t>
-      </w:r>
-    </w:p>
-    <w:p>
-      <w:pPr>
-        <w:rPr/>
-      </w:pPr>
-      <w:r>
-        <w:rPr>
-          <w:rtl w:val="0"/>
-        </w:rPr>
-        <w:t xml:space="preserve">empaquetado y despliegue (S17–S18) se </w:t>
+        <w:t xml:space="preserve"> con el núcleo de salud operativo; el empaquetado y despliegue (S17–S18) se </w:t>
       </w:r>
       <w:r>
         <w:rPr>
@@ -5732,18 +5377,7 @@
         <w:rPr>
           <w:rtl w:val="0"/>
         </w:rPr>
-        <w:t xml:space="preserve"> parcialmente al disponer ya de la API</w:t>
-      </w:r>
-    </w:p>
-    <w:p>
-      <w:pPr>
-        <w:rPr/>
-      </w:pPr>
-      <w:r>
-        <w:rPr>
-          <w:rtl w:val="0"/>
-        </w:rPr>
-        <w:t xml:space="preserve">contenerizada y publicada. Las etapas de </w:t>
+        <w:t xml:space="preserve"> parcialmente al disponer ya de la API contenerizada y publicada. Las etapas de </w:t>
       </w:r>
       <w:r>
         <w:rPr>
@@ -5757,18 +5391,7 @@
         <w:rPr>
           <w:rtl w:val="0"/>
         </w:rPr>
-        <w:t xml:space="preserve"> —parte del</w:t>
-      </w:r>
-    </w:p>
-    <w:p>
-      <w:pPr>
-        <w:rPr/>
-      </w:pPr>
-      <w:r>
-        <w:rPr>
-          <w:rtl w:val="0"/>
-        </w:rPr>
-        <w:t xml:space="preserve">alcance full stack comprometido para DUOC— y las </w:t>
+        <w:t xml:space="preserve"> —parte del alcance full stack comprometido para DUOC— y las </w:t>
       </w:r>
       <w:r>
         <w:rPr>
@@ -5782,29 +5405,7 @@
         <w:rPr>
           <w:rtl w:val="0"/>
         </w:rPr>
-        <w:t xml:space="preserve"> siguen el</w:t>
-      </w:r>
-    </w:p>
-    <w:p>
-      <w:pPr>
-        <w:rPr/>
-      </w:pPr>
-      <w:r>
-        <w:rPr>
-          <w:rtl w:val="0"/>
-        </w:rPr>
-        <w:t xml:space="preserve">calendario de la cascada y se abordan una vez consolidada la capa de datos y backend, respetando</w:t>
-      </w:r>
-    </w:p>
-    <w:p>
-      <w:pPr>
-        <w:rPr/>
-      </w:pPr>
-      <w:r>
-        <w:rPr>
-          <w:rtl w:val="0"/>
-        </w:rPr>
-        <w:t xml:space="preserve">la secuencialidad del método.</w:t>
+        <w:t xml:space="preserve"> siguen el calendario de la cascada y se abordan una vez consolidada la capa de datos y backend, respetando la secuencialidad del método.</w:t>
       </w:r>
     </w:p>
     <w:p>
@@ -5880,7 +5481,7 @@
           <w:between w:space="0" w:sz="0" w:val="nil"/>
         </w:pBdr>
         <w:shd w:fill="auto" w:val="clear"/>
-        <w:spacing w:after="200" w:before="0" w:line="276" w:lineRule="auto"/>
+        <w:spacing w:after="200" w:before="0" w:line="360" w:lineRule="auto"/>
         <w:ind w:left="360" w:right="0" w:hanging="360"/>
         <w:jc w:val="left"/>
         <w:rPr/>
@@ -5923,38 +5524,11 @@
         </w:rPr>
         <w:t xml:space="preserve"> contar con el ERS y la</w:t>
       </w:r>
-    </w:p>
-    <w:p>
-      <w:pPr>
-        <w:rPr/>
-      </w:pPr>
-      <w:r>
-        <w:rPr>
-          <w:rtl w:val="0"/>
-        </w:rPr>
-        <w:t xml:space="preserve">especificación de endpoints ya definidos eliminó la incertidumbre de alcance y permitió que</w:t>
-      </w:r>
-    </w:p>
-    <w:p>
-      <w:pPr>
-        <w:rPr/>
-      </w:pPr>
-      <w:r>
-        <w:rPr>
-          <w:rtl w:val="0"/>
-        </w:rPr>
-        <w:t xml:space="preserve">El equipo se concentrará en el diseño y la construcción. Esto es coherente con el enfoque</w:t>
-      </w:r>
-    </w:p>
-    <w:p>
-      <w:pPr>
-        <w:rPr/>
-      </w:pPr>
-      <w:r>
-        <w:rPr>
-          <w:rtl w:val="0"/>
-        </w:rPr>
-        <w:t xml:space="preserve">Cascada, que requiere requisitos estables al inicio.</w:t>
+      <w:r>
+        <w:rPr>
+          <w:rtl w:val="0"/>
+        </w:rPr>
+        <w:t xml:space="preserve"> especificación de endpoints ya definidos eliminó la incertidumbre de alcance y permitió que el equipo se concentrara en el diseño y la construcción. Esto es coherente con el enfoque Cascada, que requiere requisitos estables al inicio.</w:t>
       </w:r>
     </w:p>
     <w:p>
@@ -5975,7 +5549,7 @@
           <w:between w:space="0" w:sz="0" w:val="nil"/>
         </w:pBdr>
         <w:shd w:fill="auto" w:val="clear"/>
-        <w:spacing w:after="200" w:before="0" w:line="276" w:lineRule="auto"/>
+        <w:spacing w:after="200" w:before="0" w:line="360" w:lineRule="auto"/>
         <w:ind w:left="360" w:right="0" w:hanging="360"/>
         <w:jc w:val="left"/>
         <w:rPr/>
@@ -6018,38 +5592,11 @@
         </w:rPr>
         <w:t xml:space="preserve"> la distribución DBA (Juan Mora) / Arquitecto de</w:t>
       </w:r>
-    </w:p>
-    <w:p>
-      <w:pPr>
-        <w:rPr/>
-      </w:pPr>
-      <w:r>
-        <w:rPr>
-          <w:rtl w:val="0"/>
-        </w:rPr>
-        <w:t xml:space="preserve">Datos (Benjamín Camus) / Full Stack y DevSecOps (Javier Cerna) permitió avanzar en paralelo en</w:t>
-      </w:r>
-    </w:p>
-    <w:p>
-      <w:pPr>
-        <w:rPr/>
-      </w:pPr>
-      <w:r>
-        <w:rPr>
-          <w:rtl w:val="0"/>
-        </w:rPr>
-        <w:t xml:space="preserve">el modelado de datos y el backend, y cubre las competencias necesarias para completar la</w:t>
-      </w:r>
-    </w:p>
-    <w:p>
-      <w:pPr>
-        <w:rPr/>
-      </w:pPr>
-      <w:r>
-        <w:rPr>
-          <w:rtl w:val="0"/>
-        </w:rPr>
-        <w:t xml:space="preserve">solución full stack (incluida la capa móvil en Flutter) en las etapas siguientes.</w:t>
+      <w:r>
+        <w:rPr>
+          <w:rtl w:val="0"/>
+        </w:rPr>
+        <w:t xml:space="preserve"> Datos (Benjamín Camus) / Full Stack y DevSecOps (Javier Cerna) permitió avanzar en paralelo en el modelado de datos y el backend, y cubre las competencias necesarias para completar la solución full stack (incluida la capa móvil en Flutter) en las etapas siguientes.</w:t>
       </w:r>
     </w:p>
     <w:p>
@@ -6070,7 +5617,7 @@
           <w:between w:space="0" w:sz="0" w:val="nil"/>
         </w:pBdr>
         <w:shd w:fill="auto" w:val="clear"/>
-        <w:spacing w:after="200" w:before="0" w:line="276" w:lineRule="auto"/>
+        <w:spacing w:after="200" w:before="0" w:line="360" w:lineRule="auto"/>
         <w:ind w:left="360" w:right="0" w:hanging="360"/>
         <w:jc w:val="left"/>
         <w:rPr/>
@@ -6113,16 +5660,11 @@
         </w:rPr>
         <w:t xml:space="preserve"> disponer de la API en un dominio propio con túnel Cloudflare dio una</w:t>
       </w:r>
-    </w:p>
-    <w:p>
-      <w:pPr>
-        <w:rPr/>
-      </w:pPr>
-      <w:r>
-        <w:rPr>
-          <w:rtl w:val="0"/>
-        </w:rPr>
-        <w:t xml:space="preserve">evidencia tangible y verificable del avance, y adelantó parte de la etapa de despliegue.</w:t>
+      <w:r>
+        <w:rPr>
+          <w:rtl w:val="0"/>
+        </w:rPr>
+        <w:t xml:space="preserve"> evidencia tangible y verificable del avance, y adelantó parte de la etapa de despliegue.</w:t>
       </w:r>
     </w:p>
     <w:p>
@@ -6161,7 +5703,7 @@
           <w:between w:space="0" w:sz="0" w:val="nil"/>
         </w:pBdr>
         <w:shd w:fill="auto" w:val="clear"/>
-        <w:spacing w:after="200" w:before="0" w:line="276" w:lineRule="auto"/>
+        <w:spacing w:after="200" w:before="0" w:line="360" w:lineRule="auto"/>
         <w:ind w:left="360" w:right="0" w:hanging="360"/>
         <w:jc w:val="left"/>
         <w:rPr/>
@@ -6204,16 +5746,11 @@
         </w:rPr>
         <w:t xml:space="preserve"> señalada como obstaculizador en la Fase 1. Se abordó</w:t>
       </w:r>
-    </w:p>
-    <w:p>
-      <w:pPr>
-        <w:rPr/>
-      </w:pPr>
-      <w:r>
-        <w:rPr>
-          <w:rtl w:val="0"/>
-        </w:rPr>
-        <w:t xml:space="preserve">usando contenedores Docker, lo que estandarizó el entorno y redujo la fricción de despliegue.</w:t>
+      <w:r>
+        <w:rPr>
+          <w:rtl w:val="0"/>
+        </w:rPr>
+        <w:t xml:space="preserve"> usando contenedores Docker, lo que estandarizó el entorno y redujo la fricción de despliegue.</w:t>
       </w:r>
     </w:p>
     <w:p>
@@ -6234,7 +5771,7 @@
           <w:between w:space="0" w:sz="0" w:val="nil"/>
         </w:pBdr>
         <w:shd w:fill="auto" w:val="clear"/>
-        <w:spacing w:after="200" w:before="0" w:line="276" w:lineRule="auto"/>
+        <w:spacing w:after="200" w:before="0" w:line="360" w:lineRule="auto"/>
         <w:ind w:left="360" w:right="0" w:hanging="360"/>
         <w:jc w:val="left"/>
         <w:rPr/>
@@ -6277,16 +5814,11 @@
         </w:rPr>
         <w:t xml:space="preserve"> riesgo identificado en Fase 1. Se mitigó con</w:t>
       </w:r>
-    </w:p>
-    <w:p>
-      <w:pPr>
-        <w:rPr/>
-      </w:pPr>
-      <w:r>
-        <w:rPr>
-          <w:rtl w:val="0"/>
-        </w:rPr>
-        <w:t xml:space="preserve">un </w:t>
+      <w:r>
+        <w:rPr>
+          <w:rtl w:val="0"/>
+        </w:rPr>
+        <w:t xml:space="preserve"> un </w:t>
       </w:r>
       <w:r>
         <w:rPr>
@@ -6300,18 +5832,7 @@
         <w:rPr>
           <w:rtl w:val="0"/>
         </w:rPr>
-        <w:t xml:space="preserve"> desacoplado por la API de ingesta batch, evitando el</w:t>
-      </w:r>
-    </w:p>
-    <w:p>
-      <w:pPr>
-        <w:rPr/>
-      </w:pPr>
-      <w:r>
-        <w:rPr>
-          <w:rtl w:val="0"/>
-        </w:rPr>
-        <w:t xml:space="preserve">bloqueo técnico, tal como se había previsto como solución en la Factibilidad del proyecto.</w:t>
+        <w:t xml:space="preserve"> desacoplado por la API de ingesta batch, evitando el bloqueo técnico, tal como se había previsto como solución en la Factibilidad del proyecto.</w:t>
       </w:r>
     </w:p>
     <w:p>
@@ -6332,7 +5853,7 @@
           <w:between w:space="0" w:sz="0" w:val="nil"/>
         </w:pBdr>
         <w:shd w:fill="auto" w:val="clear"/>
-        <w:spacing w:after="200" w:before="0" w:line="276" w:lineRule="auto"/>
+        <w:spacing w:after="200" w:before="0" w:line="360" w:lineRule="auto"/>
         <w:ind w:left="360" w:right="0" w:hanging="360"/>
         <w:jc w:val="left"/>
         <w:rPr/>
@@ -6375,16 +5896,23 @@
         </w:rPr>
         <w:t xml:space="preserve"> al revisar el modelo contra las formas normales se detectaron</w:t>
       </w:r>
+      <w:r>
+        <w:rPr>
+          <w:rtl w:val="0"/>
+        </w:rPr>
+        <w:t xml:space="preserve"> oportunidades de mejora (arreglos JSON, dependencias parciales, un typo que inutilizaba un trigger). Se corrigieron y documentaron antes de avanzar, elevando la calidad del diseño.</w:t>
+      </w:r>
     </w:p>
     <w:p>
       <w:pPr>
+        <w:pStyle w:val="Heading3"/>
         <w:rPr/>
       </w:pPr>
       <w:r>
         <w:rPr>
           <w:rtl w:val="0"/>
         </w:rPr>
-        <w:t xml:space="preserve">oportunidades de mejora (arreglos JSON, dependencias parciales, un typo que inutilizaba un</w:t>
+        <w:t xml:space="preserve">Actividades ajustadas o eliminadas</w:t>
       </w:r>
     </w:p>
     <w:p>
@@ -6395,29 +5923,6 @@
         <w:rPr>
           <w:rtl w:val="0"/>
         </w:rPr>
-        <w:t xml:space="preserve">trigger). Se corrigieron y documentaron antes de avanzar, elevando la calidad del diseño.</w:t>
-      </w:r>
-    </w:p>
-    <w:p>
-      <w:pPr>
-        <w:pStyle w:val="Heading3"/>
-        <w:rPr/>
-      </w:pPr>
-      <w:r>
-        <w:rPr>
-          <w:rtl w:val="0"/>
-        </w:rPr>
-        <w:t xml:space="preserve">Actividades ajustadas o eliminadas</w:t>
-      </w:r>
-    </w:p>
-    <w:p>
-      <w:pPr>
-        <w:rPr/>
-      </w:pPr>
-      <w:r>
-        <w:rPr>
-          <w:rtl w:val="0"/>
-        </w:rPr>
         <w:t xml:space="preserve">No se eliminaron actividades. Se realizaron dos </w:t>
       </w:r>
       <w:r>
@@ -6432,18 +5937,7 @@
         <w:rPr>
           <w:rtl w:val="0"/>
         </w:rPr>
-        <w:t xml:space="preserve"> en la Fase 1,</w:t>
-      </w:r>
-    </w:p>
-    <w:p>
-      <w:pPr>
-        <w:rPr/>
-      </w:pPr>
-      <w:r>
-        <w:rPr>
-          <w:rtl w:val="0"/>
-        </w:rPr>
-        <w:t xml:space="preserve">que fortalecen el proyecto sin alterar su alcance:</w:t>
+        <w:t xml:space="preserve"> en la Fase 1, que fortalecen el proyecto sin alterar su alcance:</w:t>
       </w:r>
     </w:p>
     <w:p>
@@ -6464,7 +5958,7 @@
           <w:between w:space="0" w:sz="0" w:val="nil"/>
         </w:pBdr>
         <w:shd w:fill="auto" w:val="clear"/>
-        <w:spacing w:after="200" w:before="0" w:line="276" w:lineRule="auto"/>
+        <w:spacing w:after="200" w:before="0" w:line="360" w:lineRule="auto"/>
         <w:ind w:left="360" w:right="0" w:hanging="360"/>
         <w:jc w:val="left"/>
         <w:rPr/>
@@ -6586,7 +6080,7 @@
           <w:between w:space="0" w:sz="0" w:val="nil"/>
         </w:pBdr>
         <w:shd w:fill="auto" w:val="clear"/>
-        <w:spacing w:after="200" w:before="0" w:line="276" w:lineRule="auto"/>
+        <w:spacing w:after="200" w:before="0" w:line="360" w:lineRule="auto"/>
         <w:ind w:left="360" w:right="0" w:hanging="360"/>
         <w:jc w:val="left"/>
         <w:rPr/>
@@ -6667,16 +6161,11 @@
         </w:rPr>
         <w:t xml:space="preserve">): se incorporaron cuatro</w:t>
       </w:r>
-    </w:p>
-    <w:p>
-      <w:pPr>
-        <w:rPr/>
-      </w:pPr>
-      <w:r>
-        <w:rPr>
-          <w:rtl w:val="0"/>
-        </w:rPr>
-        <w:t xml:space="preserve">tablas transversales (</w:t>
+      <w:r>
+        <w:rPr>
+          <w:rtl w:val="0"/>
+        </w:rPr>
+        <w:t xml:space="preserve"> tablas transversales (</w:t>
       </w:r>
       <w:r>
         <w:rPr>
@@ -6724,13 +6213,8 @@
         <w:rPr>
           <w:rtl w:val="0"/>
         </w:rPr>
-        <w:t xml:space="preserve">,</w:t>
-      </w:r>
-    </w:p>
-    <w:p>
-      <w:pPr>
-        <w:rPr/>
-      </w:pPr>
+        <w:t xml:space="preserve">, </w:t>
+      </w:r>
       <w:r>
         <w:rPr>
           <w:rFonts w:ascii="Consolas" w:cs="Consolas" w:eastAsia="Consolas" w:hAnsi="Consolas"/>
@@ -6745,51 +6229,7 @@
         <w:rPr>
           <w:rtl w:val="0"/>
         </w:rPr>
-        <w:t xml:space="preserve">) que responden a escenarios del mundo real y a requisitos no funcionales</w:t>
-      </w:r>
-    </w:p>
-    <w:p>
-      <w:pPr>
-        <w:rPr/>
-      </w:pPr>
-      <w:r>
-        <w:rPr>
-          <w:rtl w:val="0"/>
-        </w:rPr>
-        <w:t xml:space="preserve">(trazabilidad clínica, configurabilidad, historización, modelo freemium).</w:t>
-      </w:r>
-    </w:p>
-    <w:p>
-      <w:pPr>
-        <w:rPr/>
-      </w:pPr>
-      <w:r>
-        <w:rPr>
-          <w:rtl w:val="0"/>
-        </w:rPr>
-        <w:t xml:space="preserve">Adicionalmente, se corrigió la descripción de la persistencia de datos respecto de la Fase 1</w:t>
-      </w:r>
-    </w:p>
-    <w:p>
-      <w:pPr>
-        <w:rPr/>
-      </w:pPr>
-      <w:r>
-        <w:rPr>
-          <w:rtl w:val="0"/>
-        </w:rPr>
-        <w:t xml:space="preserve">(de "híbrida/documental" a "relacional normalizada en PostgreSQL"), para que la documentación</w:t>
-      </w:r>
-    </w:p>
-    <w:p>
-      <w:pPr>
-        <w:rPr/>
-      </w:pPr>
-      <w:r>
-        <w:rPr>
-          <w:rtl w:val="0"/>
-        </w:rPr>
-        <w:t xml:space="preserve">refleje fielmente el modelo construido. Este es el único ajuste de redacción respecto del</w:t>
+        <w:t xml:space="preserve">) que responden a escenarios del mundo real y a requisitos no funcionales (trazabilidad clínica, configurabilidad, historización, modelo freemium). Adicionalmente, se corrigió la descripción de la persistencia de datos respecto de la Fase 1 (de "híbrida/documental" a "relacional normalizada en PostgreSQL"), para que la documentación refleje fielmente el modelo construido. Este es el único ajuste de redacción respecto del</w:t>
       </w:r>
     </w:p>
     <w:p>
@@ -6833,7 +6273,7 @@
           <w:between w:space="0" w:sz="0" w:val="nil"/>
         </w:pBdr>
         <w:shd w:fill="auto" w:val="clear"/>
-        <w:spacing w:after="200" w:before="0" w:line="276" w:lineRule="auto"/>
+        <w:spacing w:after="200" w:before="0" w:line="360" w:lineRule="auto"/>
         <w:ind w:left="360" w:right="0" w:hanging="360"/>
         <w:jc w:val="left"/>
         <w:rPr/>
@@ -6876,38 +6316,11 @@
         </w:rPr>
         <w:t xml:space="preserve"> no iniciado. Corresponde a una etapa posterior del</w:t>
       </w:r>
-    </w:p>
-    <w:p>
-      <w:pPr>
-        <w:rPr/>
-      </w:pPr>
-      <w:r>
-        <w:rPr>
-          <w:rtl w:val="0"/>
-        </w:rPr>
-        <w:t xml:space="preserve">cronograma en cascada; su no inicio es conforme a lo planificado, no un retraso. Para la</w:t>
-      </w:r>
-    </w:p>
-    <w:p>
-      <w:pPr>
-        <w:rPr/>
-      </w:pPr>
-      <w:r>
-        <w:rPr>
-          <w:rtl w:val="0"/>
-        </w:rPr>
-        <w:t xml:space="preserve">validación temprana del backend se dispone de un cliente de prueba HTML servido por la propia</w:t>
-      </w:r>
-    </w:p>
-    <w:p>
-      <w:pPr>
-        <w:rPr/>
-      </w:pPr>
-      <w:r>
-        <w:rPr>
-          <w:rtl w:val="0"/>
-        </w:rPr>
-        <w:t xml:space="preserve">API (</w:t>
+      <w:r>
+        <w:rPr>
+          <w:rtl w:val="0"/>
+        </w:rPr>
+        <w:t xml:space="preserve"> cronograma en cascada; su no inicio es conforme a lo planificado, no un retraso. Para la validación temprana del backend se dispone de un cliente de prueba HTML servido por la propia API (</w:t>
       </w:r>
       <w:r>
         <w:rPr>
@@ -6944,7 +6357,7 @@
           <w:between w:space="0" w:sz="0" w:val="nil"/>
         </w:pBdr>
         <w:shd w:fill="auto" w:val="clear"/>
-        <w:spacing w:after="200" w:before="0" w:line="276" w:lineRule="auto"/>
+        <w:spacing w:after="200" w:before="0" w:line="360" w:lineRule="auto"/>
         <w:ind w:left="360" w:right="0" w:hanging="360"/>
         <w:jc w:val="left"/>
         <w:rPr/>
@@ -6972,28 +6385,13 @@
         <w:rPr>
           <w:rtl w:val="0"/>
         </w:rPr>
-      </w:r>
-    </w:p>
-    <w:p>
-      <w:pPr>
-        <w:rPr/>
-      </w:pPr>
-      <w:r>
-        <w:rPr>
-          <w:rtl w:val="0"/>
-        </w:rPr>
-        <w:t xml:space="preserve">no iniciados; declarados y trazados en el ERS para las etapas siguientes. El módulo Director</w:t>
-      </w:r>
-    </w:p>
-    <w:p>
-      <w:pPr>
-        <w:rPr/>
-      </w:pPr>
-      <w:r>
-        <w:rPr>
-          <w:rtl w:val="0"/>
-        </w:rPr>
-        <w:t xml:space="preserve">Musical, en particular, depende de servicios y credenciales que administra Alloxentric.</w:t>
+        <w:t xml:space="preserve"> </w:t>
+      </w:r>
+      <w:r>
+        <w:rPr>
+          <w:rtl w:val="0"/>
+        </w:rPr>
+        <w:t xml:space="preserve">no iniciados; declarados y trazados en el ERS para las etapas siguientes. El módulo Director Musical, en particular, depende de servicios y credenciales que administra Alloxentric.</w:t>
       </w:r>
     </w:p>
     <w:p>
@@ -7014,7 +6412,7 @@
           <w:between w:space="0" w:sz="0" w:val="nil"/>
         </w:pBdr>
         <w:shd w:fill="auto" w:val="clear"/>
-        <w:spacing w:after="200" w:before="0" w:line="276" w:lineRule="auto"/>
+        <w:spacing w:after="200" w:before="0" w:line="360" w:lineRule="auto"/>
         <w:ind w:left="360" w:right="0" w:hanging="360"/>
         <w:jc w:val="left"/>
         <w:rPr/>
@@ -7057,11 +6455,6 @@
         </w:rPr>
         <w:t xml:space="preserve"> no iniciadas, conforme al calendario.</w:t>
       </w:r>
-    </w:p>
-    <w:p>
-      <w:pPr>
-        <w:rPr/>
-      </w:pPr>
       <w:r>
         <w:rPr>
           <w:rtl w:val="0"/>
@@ -7136,7 +6529,7 @@
           <w:between w:space="0" w:sz="0" w:val="nil"/>
         </w:pBdr>
         <w:shd w:fill="auto" w:val="clear"/>
-        <w:spacing w:after="0" w:before="0" w:line="276" w:lineRule="auto"/>
+        <w:spacing w:after="0" w:before="0" w:line="360" w:lineRule="auto"/>
         <w:ind w:left="360" w:right="0" w:hanging="360"/>
         <w:jc w:val="left"/>
         <w:rPr/>
@@ -7198,7 +6591,7 @@
           <w:between w:space="0" w:sz="0" w:val="nil"/>
         </w:pBdr>
         <w:shd w:fill="auto" w:val="clear"/>
-        <w:spacing w:after="200" w:before="0" w:line="276" w:lineRule="auto"/>
+        <w:spacing w:after="200" w:before="0" w:line="360" w:lineRule="auto"/>
         <w:ind w:left="360" w:right="0" w:hanging="360"/>
         <w:jc w:val="left"/>
         <w:rPr/>
@@ -7241,16 +6634,11 @@
         </w:rPr>
         <w:t xml:space="preserve"> se mantiene Cascada; el avance corresponde a las etapas de Análisis, Diseño</w:t>
       </w:r>
-    </w:p>
-    <w:p>
-      <w:pPr>
-        <w:rPr/>
-      </w:pPr>
-      <w:r>
-        <w:rPr>
-          <w:rtl w:val="0"/>
-        </w:rPr>
-        <w:t xml:space="preserve">e inicio de Implementación.</w:t>
+      <w:r>
+        <w:rPr>
+          <w:rtl w:val="0"/>
+        </w:rPr>
+        <w:t xml:space="preserve"> e inicio de Implementación.</w:t>
       </w:r>
     </w:p>
     <w:p>
@@ -7271,7 +6659,7 @@
           <w:between w:space="0" w:sz="0" w:val="nil"/>
         </w:pBdr>
         <w:shd w:fill="auto" w:val="clear"/>
-        <w:spacing w:after="200" w:before="0" w:line="276" w:lineRule="auto"/>
+        <w:spacing w:after="200" w:before="0" w:line="360" w:lineRule="auto"/>
         <w:ind w:left="360" w:right="0" w:hanging="360"/>
         <w:jc w:val="left"/>
         <w:rPr/>
@@ -7352,38 +6740,11 @@
         </w:rPr>
         <w:t xml:space="preserve"> comprometida para DUOC (backend + base de</w:t>
       </w:r>
-    </w:p>
-    <w:p>
-      <w:pPr>
-        <w:rPr/>
-      </w:pPr>
-      <w:r>
-        <w:rPr>
-          <w:rtl w:val="0"/>
-        </w:rPr>
-        <w:t xml:space="preserve">datos + app móvil Flutter). El avance de esta fecha cubre las capas de datos y backend; la</w:t>
-      </w:r>
-    </w:p>
-    <w:p>
-      <w:pPr>
-        <w:rPr/>
-      </w:pPr>
-      <w:r>
-        <w:rPr>
-          <w:rtl w:val="0"/>
-        </w:rPr>
-        <w:t xml:space="preserve">capa de presentación corresponde a las etapas S12–S14 del cronograma, aún no iniciadas por</w:t>
-      </w:r>
-    </w:p>
-    <w:p>
-      <w:pPr>
-        <w:rPr/>
-      </w:pPr>
-      <w:r>
-        <w:rPr>
-          <w:rtl w:val="0"/>
-        </w:rPr>
-        <w:t xml:space="preserve">secuencialidad de la cascada.</w:t>
+      <w:r>
+        <w:rPr>
+          <w:rtl w:val="0"/>
+        </w:rPr>
+        <w:t xml:space="preserve"> datos + app móvil Flutter). El avance de esta fecha cubre las capas de datos y backend; la capa de presentación corresponde a las etapas S12–S14 del cronograma, aún no iniciadas por secuencialidad de la cascada.</w:t>
       </w:r>
     </w:p>
     <w:p>
@@ -7404,7 +6765,7 @@
           <w:between w:space="0" w:sz="0" w:val="nil"/>
         </w:pBdr>
         <w:shd w:fill="auto" w:val="clear"/>
-        <w:spacing w:after="200" w:before="0" w:line="276" w:lineRule="auto"/>
+        <w:spacing w:after="200" w:before="0" w:line="360" w:lineRule="auto"/>
         <w:ind w:left="360" w:right="0" w:hanging="360"/>
         <w:jc w:val="left"/>
         <w:rPr/>
@@ -7447,16 +6808,11 @@
         </w:rPr>
         <w:t xml:space="preserve"> las actividades S1–S6 están completadas y S7–S11 en curso, según el</w:t>
       </w:r>
-    </w:p>
-    <w:p>
-      <w:pPr>
-        <w:rPr/>
-      </w:pPr>
-      <w:r>
-        <w:rPr>
-          <w:rtl w:val="0"/>
-        </w:rPr>
-        <w:t xml:space="preserve">cronograma; el despliegue (S17–S18) se adelantó parcialmente.</w:t>
+      <w:r>
+        <w:rPr>
+          <w:rtl w:val="0"/>
+        </w:rPr>
+        <w:t xml:space="preserve"> cronograma; el despliegue (S17–S18) se adelantó parcialmente.</w:t>
       </w:r>
     </w:p>
     <w:p>
@@ -7477,7 +6833,7 @@
           <w:between w:space="0" w:sz="0" w:val="nil"/>
         </w:pBdr>
         <w:shd w:fill="auto" w:val="clear"/>
-        <w:spacing w:after="200" w:before="0" w:line="276" w:lineRule="auto"/>
+        <w:spacing w:after="200" w:before="0" w:line="360" w:lineRule="auto"/>
         <w:ind w:left="360" w:right="0" w:hanging="360"/>
         <w:jc w:val="left"/>
         <w:rPr/>
@@ -7520,16 +6876,11 @@
         </w:rPr>
         <w:t xml:space="preserve"> coinciden con las comprometidas en Fase 1 (Documento de Requerimientos y</w:t>
       </w:r>
-    </w:p>
-    <w:p>
-      <w:pPr>
-        <w:rPr/>
-      </w:pPr>
-      <w:r>
-        <w:rPr>
-          <w:rtl w:val="0"/>
-        </w:rPr>
-        <w:t xml:space="preserve">Arquitectura, Modelo de datos, Docker), más mejoras de calidad documentadas.</w:t>
+      <w:r>
+        <w:rPr>
+          <w:rtl w:val="0"/>
+        </w:rPr>
+        <w:t xml:space="preserve"> Arquitectura, Modelo de datos, Docker), más mejoras de calidad documentadas.</w:t>
       </w:r>
     </w:p>
     <w:p>
@@ -7550,7 +6901,7 @@
           <w:between w:space="0" w:sz="0" w:val="nil"/>
         </w:pBdr>
         <w:shd w:fill="auto" w:val="clear"/>
-        <w:spacing w:after="200" w:before="0" w:line="276" w:lineRule="auto"/>
+        <w:spacing w:after="200" w:before="0" w:line="360" w:lineRule="auto"/>
         <w:ind w:left="360" w:right="0" w:hanging="360"/>
         <w:jc w:val="left"/>
         <w:rPr/>
@@ -7607,9 +6958,9 @@
     </w:p>
     <w:sectPr>
       <w:footerReference r:id="rId7" w:type="default"/>
-      <w:pgSz w:h="15840" w:w="12240" w:orient="portrait"/>
-      <w:pgMar w:bottom="1440" w:top="1440" w:left="1800" w:right="1800" w:header="720" w:footer="720"/>
-      <w:pgNumType w:start="0"/>
+      <w:pgSz w:h="16838" w:w="11906" w:orient="portrait"/>
+      <w:pgMar w:bottom="1440.0000000000002" w:top="1440.0000000000002" w:left="1802.8346456692916" w:right="1802.8346456692916" w:header="720" w:footer="720"/>
+      <w:pgNumType w:start="1"/>
     </w:sectPr>
   </w:body>
 </w:document>
@@ -7619,11 +6970,76 @@
 <w:ftr xmlns:mc="http://schemas.openxmlformats.org/markup-compatibility/2006" xmlns:o="urn:schemas-microsoft-com:office:office" xmlns:r="http://schemas.openxmlformats.org/officeDocument/2006/relationships" xmlns:m="http://schemas.openxmlformats.org/officeDocument/2006/math" xmlns:v="urn:schemas-microsoft-com:vml" xmlns:wp="http://schemas.openxmlformats.org/drawingml/2006/wordprocessingDrawing" xmlns:w10="urn:schemas-microsoft-com:office:word" xmlns:w="http://schemas.openxmlformats.org/wordprocessingml/2006/main" xmlns:wne="http://schemas.microsoft.com/office/word/2006/wordml" xmlns:sl="http://schemas.openxmlformats.org/schemaLibrary/2006/main" xmlns:a="http://schemas.openxmlformats.org/drawingml/2006/main" xmlns:pic="http://schemas.openxmlformats.org/drawingml/2006/picture" xmlns:c="http://schemas.openxmlformats.org/drawingml/2006/chart" xmlns:lc="http://schemas.openxmlformats.org/drawingml/2006/lockedCanvas" xmlns:dgm="http://schemas.openxmlformats.org/drawingml/2006/diagram" xmlns:wps="http://schemas.microsoft.com/office/word/2010/wordprocessingShape" xmlns:wpg="http://schemas.microsoft.com/office/word/2010/wordprocessingGroup" xmlns:w14="http://schemas.microsoft.com/office/word/2010/wordml" xmlns:w15="http://schemas.microsoft.com/office/word/2012/wordml" xmlns:w16="http://schemas.microsoft.com/office/word/2018/wordml" xmlns:w16cex="http://schemas.microsoft.com/office/word/2018/wordml/cex" xmlns:w16cid="http://schemas.microsoft.com/office/word/2016/wordml/cid" xmlns="http://schemas.microsoft.com/office/tasks/2019/documenttasks" xmlns:cr="http://schemas.microsoft.com/office/comments/2020/reactions">
   <w:p>
     <w:pPr>
-      <w:jc w:val="right"/>
-      <w:rPr/>
+      <w:keepNext w:val="0"/>
+      <w:keepLines w:val="0"/>
+      <w:pageBreakBefore w:val="0"/>
+      <w:widowControl w:val="1"/>
+      <w:pBdr>
+        <w:top w:space="0" w:sz="0" w:val="nil"/>
+        <w:left w:space="0" w:sz="0" w:val="nil"/>
+        <w:bottom w:space="0" w:sz="0" w:val="nil"/>
+        <w:right w:space="0" w:sz="0" w:val="nil"/>
+        <w:between w:space="0" w:sz="0" w:val="nil"/>
+      </w:pBdr>
+      <w:shd w:fill="auto" w:val="clear"/>
+      <w:tabs>
+        <w:tab w:val="center" w:leader="none" w:pos="4680"/>
+        <w:tab w:val="right" w:leader="none" w:pos="9360"/>
+      </w:tabs>
+      <w:spacing w:after="0" w:before="0" w:line="240" w:lineRule="auto"/>
+      <w:ind w:left="0" w:right="0" w:firstLine="0"/>
+      <w:jc w:val="center"/>
+      <w:rPr>
+        <w:rFonts w:ascii="Calibri" w:cs="Calibri" w:eastAsia="Calibri" w:hAnsi="Calibri"/>
+        <w:b w:val="0"/>
+        <w:bCs w:val="0"/>
+        <w:i w:val="0"/>
+        <w:iCs w:val="0"/>
+        <w:smallCaps w:val="0"/>
+        <w:strike w:val="0"/>
+        <w:color w:val="000000"/>
+        <w:sz w:val="22"/>
+        <w:szCs w:val="22"/>
+        <w:u w:val="none"/>
+        <w:shd w:fill="auto" w:val="clear"/>
+        <w:vertAlign w:val="baseline"/>
+      </w:rPr>
     </w:pPr>
     <w:r>
-      <w:rPr/>
+      <w:rPr>
+        <w:rFonts w:ascii="Calibri" w:cs="Calibri" w:eastAsia="Calibri" w:hAnsi="Calibri"/>
+        <w:b w:val="0"/>
+        <w:bCs w:val="0"/>
+        <w:i w:val="0"/>
+        <w:iCs w:val="0"/>
+        <w:smallCaps w:val="0"/>
+        <w:strike w:val="0"/>
+        <w:color w:val="808080"/>
+        <w:sz w:val="18"/>
+        <w:szCs w:val="18"/>
+        <w:u w:val="none"/>
+        <w:shd w:fill="auto" w:val="clear"/>
+        <w:vertAlign w:val="baseline"/>
+        <w:rtl w:val="0"/>
+      </w:rPr>
+      <w:t xml:space="preserve">Página </w:t>
+    </w:r>
+    <w:r>
+      <w:rPr>
+        <w:rFonts w:ascii="Calibri" w:cs="Calibri" w:eastAsia="Calibri" w:hAnsi="Calibri"/>
+        <w:b w:val="0"/>
+        <w:bCs w:val="0"/>
+        <w:i w:val="0"/>
+        <w:iCs w:val="0"/>
+        <w:smallCaps w:val="0"/>
+        <w:strike w:val="0"/>
+        <w:color w:val="000000"/>
+        <w:sz w:val="22"/>
+        <w:szCs w:val="22"/>
+        <w:u w:val="none"/>
+        <w:shd w:fill="auto" w:val="clear"/>
+        <w:vertAlign w:val="baseline"/>
+      </w:rPr>
       <w:fldChar w:fldCharType="begin"/>
       <w:instrText xml:space="preserve">PAGE</w:instrText>
       <w:fldChar w:fldCharType="separate"/>
@@ -7848,7 +7264,7 @@
     </w:rPrDefault>
     <w:pPrDefault>
       <w:pPr>
-        <w:spacing w:after="200" w:line="276" w:lineRule="auto"/>
+        <w:spacing w:after="200" w:line="360" w:lineRule="auto"/>
       </w:pPr>
     </w:pPrDefault>
   </w:docDefaults>
@@ -20155,7 +19571,7 @@
 
 <file path=customXML/item1.xml><?xml version="1.0" encoding="utf-8"?>
 <go:gDocsCustomXmlDataStorage xmlns:go="http://customooxmlschemas.google.com/" xmlns:r="http://schemas.openxmlformats.org/officeDocument/2006/relationships" uri="GoogleDocsCustomDataVersion2">
-  <go:docsCustomData xmlns:go="http://customooxmlschemas.google.com/" roundtripDataSignature="AMtx7mjDj6btjavfTSIgbHsCnvKRz6m0Tw==">CgMxLjAyDmguMzF2YXYwY2NudHh4Mg5oLnBzeGx1aTFoN2pxajIOaC43bzRnc2o3NjlvOXk4AHIhMW9wa2V6c0ZTOWFFckRWaWFwemRBa182dU9uMGJTUXVy</go:docsCustomData>
+  <go:docsCustomData xmlns:go="http://customooxmlschemas.google.com/" roundtripDataSignature="AMtx7mg9fAqPJxG/j4ctcXvTlQgtFsuVhA==">CgMxLjA4AHIhMWhCNDRhMDFNZFdXVW5LLXpCVC1Bd1JqMDBWaGpjUWNq</go:docsCustomData>
 </go:gDocsCustomXmlDataStorage>
 </file>
 

</xml_diff>